<commit_message>
court(ny): answering brief on the shared document model, latex and docx generated, cross-engine gated (fb-595.54.34)
The reply-brief layout (one family) with the 14,000-word limit of a principal brief: keyed authorities
from toa: links (pages now listed), the word count computed, counsel at the foot of the cover (fill).
The hand-written docx filter (docx/ny-answering.lua) is replaced by the generated engines; latex is new.
The optional disclosure page is not set (a before_tables block that is not set still breaks the page;
recorded as a model request).

Co-Authored-By: Claude Opus 5.5 <noreply@anthropic.com>

(fb-595.54.34)
</commit_message>
<xml_diff>
--- a/courts/second-circuit/new-york/state/court-of-appeals/answering-brief/usage/OUTPUT-answering-brief.docx
+++ b/courts/second-circuit/new-york/state/court-of-appeals/answering-brief/usage/OUTPUT-answering-brief.docx
@@ -4,21 +4,35 @@
   <w:body>
     <w:p>
       <w:pPr>
-        <w:keepNext/>
-        <w:keepLines/>
-        <w:spacing w:before="0" w:after="0" w:line="380" w:lineRule="exact"/>
+        <w:spacing w:before="0" w:after="0" w:line="322" w:lineRule="exact"/>
         <w:ind w:left="0" w:firstLine="0"/>
         <w:jc w:val="right"/>
       </w:pPr>
       <w:r>
-        <w:t xml:space="preserve">To be argued by:</w:t>
-      </w:r>
-    </w:p>
-    <w:p>
-      <w:pPr>
-        <w:keepNext/>
-        <w:keepLines/>
-        <w:spacing w:before="0" w:after="0" w:line="380" w:lineRule="exact"/>
+        <w:t xml:space="preserve">To</w:t>
+      </w:r>
+      <w:r>
+        <w:t xml:space="preserve"> </w:t>
+      </w:r>
+      <w:r>
+        <w:t xml:space="preserve">be</w:t>
+      </w:r>
+      <w:r>
+        <w:t xml:space="preserve"> </w:t>
+      </w:r>
+      <w:r>
+        <w:t xml:space="preserve">argued</w:t>
+      </w:r>
+      <w:r>
+        <w:t xml:space="preserve"> </w:t>
+      </w:r>
+      <w:r>
+        <w:t xml:space="preserve">by:</w:t>
+      </w:r>
+    </w:p>
+    <w:p>
+      <w:pPr>
+        <w:spacing w:before="0" w:after="448" w:line="322" w:lineRule="exact"/>
         <w:ind w:left="0" w:firstLine="0"/>
         <w:jc w:val="right"/>
       </w:pPr>
@@ -58,9 +72,7 @@
     </w:p>
     <w:p>
       <w:pPr>
-        <w:keepNext/>
-        <w:keepLines/>
-        <w:spacing w:before="760" w:after="0" w:line="380" w:lineRule="exact"/>
+        <w:spacing w:before="0" w:after="0" w:line="322" w:lineRule="exact"/>
         <w:ind w:left="0" w:firstLine="0"/>
         <w:jc w:val="center"/>
       </w:pPr>
@@ -69,14 +81,40 @@
           <w:b/>
           <w:bCs/>
         </w:rPr>
-        <w:t xml:space="preserve">Court of Appeals</w:t>
-      </w:r>
-    </w:p>
-    <w:p>
-      <w:pPr>
-        <w:keepNext/>
-        <w:keepLines/>
-        <w:spacing w:before="0" w:after="0" w:line="380" w:lineRule="exact"/>
+        <w:t xml:space="preserve">Court</w:t>
+      </w:r>
+      <w:r>
+        <w:rPr>
+          <w:b/>
+          <w:bCs/>
+        </w:rPr>
+        <w:t xml:space="preserve"> </w:t>
+      </w:r>
+      <w:r>
+        <w:rPr>
+          <w:b/>
+          <w:bCs/>
+        </w:rPr>
+        <w:t xml:space="preserve">of</w:t>
+      </w:r>
+      <w:r>
+        <w:rPr>
+          <w:b/>
+          <w:bCs/>
+        </w:rPr>
+        <w:t xml:space="preserve"> </w:t>
+      </w:r>
+      <w:r>
+        <w:rPr>
+          <w:b/>
+          <w:bCs/>
+        </w:rPr>
+        <w:t xml:space="preserve">Appeals</w:t>
+      </w:r>
+    </w:p>
+    <w:p>
+      <w:pPr>
+        <w:spacing w:before="56" w:after="0" w:line="322" w:lineRule="exact"/>
         <w:ind w:left="0" w:firstLine="0"/>
         <w:jc w:val="center"/>
       </w:pPr>
@@ -85,14 +123,82 @@
           <w:b/>
           <w:bCs/>
         </w:rPr>
-        <w:t xml:space="preserve">of the State of New York</w:t>
-      </w:r>
-    </w:p>
-    <w:p>
-      <w:pPr>
-        <w:keepNext/>
-        <w:keepLines/>
-        <w:spacing w:before="760" w:after="0" w:line="380" w:lineRule="exact"/>
+        <w:t xml:space="preserve">of</w:t>
+      </w:r>
+      <w:r>
+        <w:rPr>
+          <w:b/>
+          <w:bCs/>
+        </w:rPr>
+        <w:t xml:space="preserve"> </w:t>
+      </w:r>
+      <w:r>
+        <w:rPr>
+          <w:b/>
+          <w:bCs/>
+        </w:rPr>
+        <w:t xml:space="preserve">the</w:t>
+      </w:r>
+      <w:r>
+        <w:rPr>
+          <w:b/>
+          <w:bCs/>
+        </w:rPr>
+        <w:t xml:space="preserve"> </w:t>
+      </w:r>
+      <w:r>
+        <w:rPr>
+          <w:b/>
+          <w:bCs/>
+        </w:rPr>
+        <w:t xml:space="preserve">State</w:t>
+      </w:r>
+      <w:r>
+        <w:rPr>
+          <w:b/>
+          <w:bCs/>
+        </w:rPr>
+        <w:t xml:space="preserve"> </w:t>
+      </w:r>
+      <w:r>
+        <w:rPr>
+          <w:b/>
+          <w:bCs/>
+        </w:rPr>
+        <w:t xml:space="preserve">of</w:t>
+      </w:r>
+      <w:r>
+        <w:rPr>
+          <w:b/>
+          <w:bCs/>
+        </w:rPr>
+        <w:t xml:space="preserve"> </w:t>
+      </w:r>
+      <w:r>
+        <w:rPr>
+          <w:b/>
+          <w:bCs/>
+        </w:rPr>
+        <w:t xml:space="preserve">New</w:t>
+      </w:r>
+      <w:r>
+        <w:rPr>
+          <w:b/>
+          <w:bCs/>
+        </w:rPr>
+        <w:t xml:space="preserve"> </w:t>
+      </w:r>
+      <w:r>
+        <w:rPr>
+          <w:b/>
+          <w:bCs/>
+        </w:rPr>
+        <w:t xml:space="preserve">York</w:t>
+      </w:r>
+    </w:p>
+    <w:p>
+      <w:pPr>
+        <w:spacing w:before="336" w:after="0" w:line="322" w:lineRule="exact"/>
         <w:ind w:left="0" w:firstLine="0"/>
         <w:jc w:val="center"/>
       </w:pPr>
@@ -106,9 +212,7 @@
     </w:p>
     <w:p>
       <w:pPr>
-        <w:keepNext/>
-        <w:keepLines/>
-        <w:spacing w:before="760" w:after="0" w:line="380" w:lineRule="exact"/>
+        <w:spacing w:before="420" w:after="0" w:line="322" w:lineRule="exact"/>
         <w:ind w:left="0" w:firstLine="0"/>
         <w:jc w:val="center"/>
       </w:pPr>
@@ -160,9 +264,7 @@
     </w:p>
     <w:p>
       <w:pPr>
-        <w:keepNext/>
-        <w:keepLines/>
-        <w:spacing w:before="84" w:after="0" w:line="380" w:lineRule="exact"/>
+        <w:spacing w:before="84" w:after="0" w:line="322" w:lineRule="exact"/>
         <w:ind w:left="0" w:firstLine="0"/>
         <w:jc w:val="center"/>
       </w:pPr>
@@ -172,9 +274,7 @@
     </w:p>
     <w:p>
       <w:pPr>
-        <w:keepNext/>
-        <w:keepLines/>
-        <w:spacing w:before="358" w:after="0" w:line="380" w:lineRule="exact"/>
+        <w:spacing w:before="168" w:after="168" w:line="322" w:lineRule="exact"/>
         <w:ind w:left="0" w:firstLine="0"/>
         <w:jc w:val="center"/>
       </w:pPr>
@@ -188,9 +288,7 @@
     </w:p>
     <w:p>
       <w:pPr>
-        <w:keepNext/>
-        <w:keepLines/>
-        <w:spacing w:before="358" w:after="0" w:line="380" w:lineRule="exact"/>
+        <w:spacing w:before="0" w:after="0" w:line="322" w:lineRule="exact"/>
         <w:ind w:left="0" w:firstLine="0"/>
         <w:jc w:val="center"/>
       </w:pPr>
@@ -206,9 +304,7 @@
     </w:p>
     <w:p>
       <w:pPr>
-        <w:keepNext/>
-        <w:keepLines/>
-        <w:spacing w:before="84" w:after="0" w:line="380" w:lineRule="exact"/>
+        <w:spacing w:before="84" w:after="0" w:line="322" w:lineRule="exact"/>
         <w:ind w:left="0" w:firstLine="0"/>
         <w:jc w:val="center"/>
       </w:pPr>
@@ -218,9 +314,7 @@
     </w:p>
     <w:p>
       <w:pPr>
-        <w:keepNext/>
-        <w:keepLines/>
-        <w:spacing w:before="760" w:after="0" w:line="380" w:lineRule="exact"/>
+        <w:spacing w:before="504" w:after="0" w:line="322" w:lineRule="exact"/>
         <w:ind w:left="0" w:firstLine="0"/>
         <w:jc w:val="center"/>
       </w:pPr>
@@ -262,15 +356,12 @@
     </w:p>
     <w:p>
       <w:pPr>
-        <w:keepNext/>
-        <w:keepLines/>
-        <w:spacing w:before="740" w:after="0" w:line="20" w:lineRule="exact"/>
+        <w:spacing w:before="0" w:after="0" w:line="3765" w:lineRule="exact"/>
       </w:pPr>
     </w:p>
     <w:tbl>
       <w:tblPr>
         <w:tblW w:w="9360" w:type="dxa"/>
-        <w:tblInd w:w="0" w:type="dxa"/>
         <w:tblLayout w:type="fixed"/>
         <w:tblCellMar>
           <w:top w:w="0" w:type="dxa"/>
@@ -278,10 +369,11 @@
           <w:bottom w:w="0" w:type="dxa"/>
           <w:right w:w="0" w:type="dxa"/>
         </w:tblCellMar>
+        <w:tblLook w:val="0000" w:firstRow="0" w:lastRow="0" w:firstColumn="0" w:lastColumn="0" w:noHBand="0" w:noVBand="0"/>
       </w:tblPr>
       <w:tblGrid>
+        <w:gridCol w:w="4464"/>
         <w:gridCol w:w="4896"/>
-        <w:gridCol w:w="4464"/>
       </w:tblGrid>
       <w:tr>
         <w:trPr>
@@ -289,17 +381,13 @@
         </w:trPr>
         <w:tc>
           <w:tcPr>
-            <w:tcW w:w="4896" w:type="dxa"/>
-            <w:tcMar>
-              <w:left w:w="0" w:type="dxa"/>
-              <w:right w:w="432" w:type="dxa"/>
-            </w:tcMar>
+            <w:tcW w:w="4464" w:type="dxa"/>
           </w:tcPr>
           <w:p>
             <w:pPr>
-              <w:keepLines/>
-              <w:spacing w:before="0" w:after="0" w:line="380" w:lineRule="exact"/>
+              <w:spacing w:before="0" w:after="0" w:line="322" w:lineRule="exact"/>
               <w:ind w:left="0" w:firstLine="0"/>
+              <w:jc w:val="left"/>
             </w:pPr>
             <w:r>
               <w:t xml:space="preserve">ALVIN</w:t>
@@ -325,9 +413,9 @@
           </w:p>
           <w:p>
             <w:pPr>
-              <w:keepLines/>
-              <w:spacing w:before="0" w:after="0" w:line="380" w:lineRule="exact"/>
+              <w:spacing w:before="0" w:after="0" w:line="322" w:lineRule="exact"/>
               <w:ind w:left="0" w:firstLine="0"/>
+              <w:jc w:val="left"/>
             </w:pPr>
             <w:r>
               <w:t xml:space="preserve">District</w:t>
@@ -359,9 +447,9 @@
           </w:p>
           <w:p>
             <w:pPr>
-              <w:keepLines/>
-              <w:spacing w:before="0" w:after="0" w:line="380" w:lineRule="exact"/>
+              <w:spacing w:before="84" w:after="0" w:line="322" w:lineRule="exact"/>
               <w:ind w:left="0" w:firstLine="0"/>
+              <w:jc w:val="left"/>
             </w:pPr>
             <w:r>
               <w:rPr>
@@ -401,9 +489,9 @@
           </w:p>
           <w:p>
             <w:pPr>
-              <w:keepLines/>
-              <w:spacing w:before="0" w:after="0" w:line="380" w:lineRule="exact"/>
+              <w:spacing w:before="0" w:after="0" w:line="322" w:lineRule="exact"/>
               <w:ind w:left="0" w:firstLine="0"/>
+              <w:jc w:val="left"/>
             </w:pPr>
             <w:r>
               <w:rPr>
@@ -443,9 +531,9 @@
           </w:p>
           <w:p>
             <w:pPr>
-              <w:keepLines/>
-              <w:spacing w:before="0" w:after="0" w:line="380" w:lineRule="exact"/>
+              <w:spacing w:before="0" w:after="0" w:line="322" w:lineRule="exact"/>
               <w:ind w:left="0" w:firstLine="0"/>
+              <w:jc w:val="left"/>
             </w:pPr>
             <w:r>
               <w:rPr>
@@ -514,17 +602,16 @@
         </w:tc>
         <w:tc>
           <w:tcPr>
-            <w:tcW w:w="4464" w:type="dxa"/>
+            <w:tcW w:w="4896" w:type="dxa"/>
             <w:tcMar>
-              <w:left w:w="0" w:type="dxa"/>
-              <w:right w:w="0" w:type="dxa"/>
+              <w:left w:w="432" w:type="dxa"/>
             </w:tcMar>
           </w:tcPr>
           <w:p>
             <w:pPr>
-              <w:keepLines/>
-              <w:spacing w:before="0" w:after="0" w:line="380" w:lineRule="exact"/>
+              <w:spacing w:before="0" w:after="0" w:line="322" w:lineRule="exact"/>
               <w:ind w:left="0" w:firstLine="0"/>
+              <w:jc w:val="left"/>
             </w:pPr>
             <w:r>
               <w:t xml:space="preserve">STEVEN</w:t>
@@ -544,9 +631,9 @@
           </w:p>
           <w:p>
             <w:pPr>
-              <w:keepLines/>
-              <w:spacing w:before="0" w:after="0" w:line="380" w:lineRule="exact"/>
+              <w:spacing w:before="0" w:after="0" w:line="322" w:lineRule="exact"/>
               <w:ind w:left="0" w:firstLine="0"/>
+              <w:jc w:val="left"/>
             </w:pPr>
             <w:r>
               <w:t xml:space="preserve">Chief,</w:t>
@@ -566,9 +653,9 @@
           </w:p>
           <w:p>
             <w:pPr>
-              <w:keepLines/>
-              <w:spacing w:before="0" w:after="0" w:line="380" w:lineRule="exact"/>
+              <w:spacing w:before="0" w:after="0" w:line="322" w:lineRule="exact"/>
               <w:ind w:left="0" w:firstLine="0"/>
+              <w:jc w:val="left"/>
             </w:pPr>
             <w:r>
               <w:t xml:space="preserve">STEPHEN</w:t>
@@ -588,9 +675,9 @@
           </w:p>
           <w:p>
             <w:pPr>
-              <w:keepLines/>
-              <w:spacing w:before="0" w:after="0" w:line="380" w:lineRule="exact"/>
+              <w:spacing w:before="0" w:after="0" w:line="322" w:lineRule="exact"/>
               <w:ind w:left="0" w:firstLine="0"/>
+              <w:jc w:val="left"/>
             </w:pPr>
             <w:r>
               <w:t xml:space="preserve">MICHAEL</w:t>
@@ -610,9 +697,9 @@
           </w:p>
           <w:p>
             <w:pPr>
-              <w:keepLines/>
-              <w:spacing w:before="0" w:after="0" w:line="380" w:lineRule="exact"/>
+              <w:spacing w:before="0" w:after="0" w:line="322" w:lineRule="exact"/>
               <w:ind w:left="0" w:firstLine="0"/>
+              <w:jc w:val="left"/>
             </w:pPr>
             <w:r>
               <w:t xml:space="preserve">Assistant</w:t>
@@ -632,9 +719,9 @@
           </w:p>
           <w:p>
             <w:pPr>
-              <w:keepLines/>
-              <w:spacing w:before="0" w:after="0" w:line="380" w:lineRule="exact"/>
+              <w:spacing w:before="84" w:after="0" w:line="322" w:lineRule="exact"/>
               <w:ind w:left="0" w:firstLine="0"/>
+              <w:jc w:val="left"/>
             </w:pPr>
             <w:r>
               <w:rPr>
@@ -663,10 +750,9 @@
     </w:tbl>
     <w:p>
       <w:pPr>
-        <w:keepNext/>
-        <w:keepLines/>
-        <w:spacing w:before="224" w:after="0" w:line="380" w:lineRule="exact"/>
+        <w:spacing w:before="224" w:after="0" w:line="322" w:lineRule="exact"/>
         <w:ind w:left="0" w:firstLine="0"/>
+        <w:jc w:val="left"/>
       </w:pPr>
       <w:r>
         <w:t xml:space="preserve">Telephone:</w:t>
@@ -688,10 +774,9 @@
     </w:p>
     <w:p>
       <w:pPr>
-        <w:keepNext/>
-        <w:keepLines/>
-        <w:spacing w:before="0" w:after="0" w:line="380" w:lineRule="exact"/>
+        <w:spacing w:before="84" w:after="0" w:line="322" w:lineRule="exact"/>
         <w:ind w:left="0" w:firstLine="0"/>
+        <w:jc w:val="left"/>
       </w:pPr>
       <w:r>
         <w:t xml:space="preserve">Facsimile:</w:t>
@@ -713,9 +798,9 @@
     </w:p>
     <w:p>
       <w:pPr>
-        <w:keepLines/>
-        <w:spacing w:before="112" w:after="0" w:line="380" w:lineRule="exact"/>
+        <w:spacing w:before="84" w:after="0" w:line="322" w:lineRule="exact"/>
         <w:ind w:left="0" w:firstLine="0"/>
+        <w:jc w:val="left"/>
       </w:pPr>
       <w:r>
         <w:t xml:space="preserve">January</w:t>
@@ -735,11 +820,12 @@
     </w:p>
     <w:p>
       <w:pPr>
-        <w:spacing w:before="0" w:after="0" w:line="20" w:lineRule="exact"/>
+        <w:spacing w:before="0" w:after="0" w:line="1" w:lineRule="exact"/>
         <w:sectPr>
-          <w:footerReference w:type="default" r:id="rIdFtrNone"/>
+          <w:footerReference w:type="default" r:id="rIdXdNone"/>
           <w:pgSz w:w="12240" w:h="15840"/>
-          <w:pgMar w:top="1440" w:right="1440" w:bottom="1440" w:left="1440" w:header="720" w:footer="644" w:gutter="0"/>
+          <w:pgMar w:top="1440" w:right="1440" w:bottom="1440" w:left="1440" w:header="720" w:footer="686" w:gutter="0"/>
+          <w:pgNumType w:fmt="lowerRoman" w:start="1"/>
         </w:sectPr>
       </w:pPr>
     </w:p>
@@ -747,7 +833,7 @@
       <w:pPr>
         <w:keepNext/>
         <w:keepLines/>
-        <w:spacing w:before="0" w:after="280" w:line="380" w:lineRule="exact"/>
+        <w:spacing w:before="0" w:after="336" w:line="322" w:lineRule="exact"/>
         <w:ind w:left="0" w:firstLine="0"/>
         <w:jc w:val="center"/>
       </w:pPr>
@@ -756,24 +842,35 @@
           <w:b/>
           <w:bCs/>
         </w:rPr>
-        <w:t xml:space="preserve">TABLE OF CONTENTS</w:t>
-      </w:r>
-    </w:p>
-    <w:p>
-      <w:pPr>
-        <w:keepNext/>
-        <w:keepLines/>
-        <w:spacing w:before="0" w:after="0" w:line="380" w:lineRule="exact"/>
-        <w:ind w:left="0" w:firstLine="0"/>
-        <w:jc w:val="right"/>
-      </w:pPr>
-      <w:r>
-        <w:rPr>
-          <w:b/>
-          <w:bCs/>
-          <w:u w:val="single"/>
-        </w:rPr>
-        <w:t xml:space="preserve">Page</w:t>
+        <w:t xml:space="preserve">TABLE</w:t>
+      </w:r>
+      <w:r>
+        <w:rPr>
+          <w:b/>
+          <w:bCs/>
+        </w:rPr>
+        <w:t xml:space="preserve"> </w:t>
+      </w:r>
+      <w:r>
+        <w:rPr>
+          <w:b/>
+          <w:bCs/>
+        </w:rPr>
+        <w:t xml:space="preserve">OF</w:t>
+      </w:r>
+      <w:r>
+        <w:rPr>
+          <w:b/>
+          <w:bCs/>
+        </w:rPr>
+        <w:t xml:space="preserve"> </w:t>
+      </w:r>
+      <w:r>
+        <w:rPr>
+          <w:b/>
+          <w:bCs/>
+        </w:rPr>
+        <w:t xml:space="preserve">CONTENTS</w:t>
       </w:r>
     </w:p>
     <w:p>
@@ -782,8 +879,8 @@
         <w:tabs>
           <w:tab w:val="right" w:leader="dot" w:pos="9360"/>
         </w:tabs>
-        <w:spacing w:before="168" w:after="0" w:line="380" w:lineRule="exact"/>
-        <w:ind w:left="0" w:right="720" w:firstLine="0"/>
+        <w:spacing w:before="140" w:after="0" w:line="322" w:lineRule="exact"/>
+        <w:ind w:left="360" w:right="720" w:hanging="360"/>
       </w:pPr>
       <w:r>
         <w:t xml:space="preserve">Preliminary</w:t>
@@ -795,11 +892,7 @@
         <w:t xml:space="preserve">Statement</w:t>
       </w:r>
       <w:r>
-        <w:rPr>
-          <w:sz w:val="25"/>
-          <w:szCs w:val="25"/>
-        </w:rPr>
-        <w:t xml:space="preserve">  </w:t>
+        <w:t xml:space="preserve">   </w:t>
       </w:r>
       <w:r>
         <w:tab/>
@@ -814,8 +907,8 @@
         <w:tabs>
           <w:tab w:val="right" w:leader="dot" w:pos="9360"/>
         </w:tabs>
-        <w:spacing w:before="168" w:after="0" w:line="380" w:lineRule="exact"/>
-        <w:ind w:left="0" w:right="720" w:firstLine="0"/>
+        <w:spacing w:before="140" w:after="0" w:line="322" w:lineRule="exact"/>
+        <w:ind w:left="360" w:right="720" w:hanging="360"/>
       </w:pPr>
       <w:r>
         <w:t xml:space="preserve">Question</w:t>
@@ -827,11 +920,7 @@
         <w:t xml:space="preserve">Presented</w:t>
       </w:r>
       <w:r>
-        <w:rPr>
-          <w:sz w:val="25"/>
-          <w:szCs w:val="25"/>
-        </w:rPr>
-        <w:t xml:space="preserve">  </w:t>
+        <w:t xml:space="preserve">   </w:t>
       </w:r>
       <w:r>
         <w:tab/>
@@ -846,8 +935,8 @@
         <w:tabs>
           <w:tab w:val="right" w:leader="dot" w:pos="9360"/>
         </w:tabs>
-        <w:spacing w:before="168" w:after="0" w:line="380" w:lineRule="exact"/>
-        <w:ind w:left="0" w:right="720" w:firstLine="0"/>
+        <w:spacing w:before="140" w:after="0" w:line="322" w:lineRule="exact"/>
+        <w:ind w:left="360" w:right="720" w:hanging="360"/>
       </w:pPr>
       <w:r>
         <w:t xml:space="preserve">Statement</w:t>
@@ -871,11 +960,7 @@
         <w:t xml:space="preserve">Case</w:t>
       </w:r>
       <w:r>
-        <w:rPr>
-          <w:sz w:val="25"/>
-          <w:szCs w:val="25"/>
-        </w:rPr>
-        <w:t xml:space="preserve">  </w:t>
+        <w:t xml:space="preserve">   </w:t>
       </w:r>
       <w:r>
         <w:tab/>
@@ -890,8 +975,8 @@
         <w:tabs>
           <w:tab w:val="right" w:leader="dot" w:pos="9360"/>
         </w:tabs>
-        <w:spacing w:before="84" w:after="0" w:line="380" w:lineRule="exact"/>
-        <w:ind w:left="720" w:right="720" w:firstLine="0"/>
+        <w:spacing w:before="140" w:after="0" w:line="322" w:lineRule="exact"/>
+        <w:ind w:left="1080" w:right="720" w:hanging="360"/>
       </w:pPr>
       <w:r>
         <w:t xml:space="preserve">A.</w:t>
@@ -921,11 +1006,7 @@
         <w:t xml:space="preserve">Trial</w:t>
       </w:r>
       <w:r>
-        <w:rPr>
-          <w:sz w:val="25"/>
-          <w:szCs w:val="25"/>
-        </w:rPr>
-        <w:t xml:space="preserve">  </w:t>
+        <w:t xml:space="preserve">   </w:t>
       </w:r>
       <w:r>
         <w:tab/>
@@ -940,8 +1021,8 @@
         <w:tabs>
           <w:tab w:val="right" w:leader="dot" w:pos="9360"/>
         </w:tabs>
-        <w:spacing w:before="168" w:after="0" w:line="380" w:lineRule="exact"/>
-        <w:ind w:left="0" w:right="720" w:firstLine="0"/>
+        <w:spacing w:before="140" w:after="0" w:line="322" w:lineRule="exact"/>
+        <w:ind w:left="360" w:right="720" w:hanging="360"/>
       </w:pPr>
       <w:r>
         <w:t xml:space="preserve">Standard</w:t>
@@ -983,11 +1064,7 @@
         <w:t xml:space="preserve">Argument</w:t>
       </w:r>
       <w:r>
-        <w:rPr>
-          <w:sz w:val="25"/>
-          <w:szCs w:val="25"/>
-        </w:rPr>
-        <w:t xml:space="preserve">  </w:t>
+        <w:t xml:space="preserve">   </w:t>
       </w:r>
       <w:r>
         <w:tab/>
@@ -1002,18 +1079,14 @@
         <w:tabs>
           <w:tab w:val="right" w:leader="dot" w:pos="9360"/>
         </w:tabs>
-        <w:spacing w:before="168" w:after="0" w:line="380" w:lineRule="exact"/>
-        <w:ind w:left="0" w:right="720" w:firstLine="0"/>
+        <w:spacing w:before="140" w:after="0" w:line="322" w:lineRule="exact"/>
+        <w:ind w:left="360" w:right="720" w:hanging="360"/>
       </w:pPr>
       <w:r>
         <w:t xml:space="preserve">Argument</w:t>
       </w:r>
       <w:r>
-        <w:rPr>
-          <w:sz w:val="25"/>
-          <w:szCs w:val="25"/>
-        </w:rPr>
-        <w:t xml:space="preserve">  </w:t>
+        <w:t xml:space="preserve">   </w:t>
       </w:r>
       <w:r>
         <w:tab/>
@@ -1028,8 +1101,8 @@
         <w:tabs>
           <w:tab w:val="right" w:leader="dot" w:pos="9360"/>
         </w:tabs>
-        <w:spacing w:before="84" w:after="0" w:line="380" w:lineRule="exact"/>
-        <w:ind w:left="720" w:right="720" w:firstLine="0"/>
+        <w:spacing w:before="140" w:after="0" w:line="322" w:lineRule="exact"/>
+        <w:ind w:left="1080" w:right="720" w:hanging="360"/>
       </w:pPr>
       <w:r>
         <w:t xml:space="preserve">DEFENSE</w:t>
@@ -1125,11 +1198,7 @@
         <w:t xml:space="preserve">CASE</w:t>
       </w:r>
       <w:r>
-        <w:rPr>
-          <w:sz w:val="25"/>
-          <w:szCs w:val="25"/>
-        </w:rPr>
-        <w:t xml:space="preserve">  </w:t>
+        <w:t xml:space="preserve">   </w:t>
       </w:r>
       <w:r>
         <w:tab/>
@@ -1144,18 +1213,14 @@
         <w:tabs>
           <w:tab w:val="right" w:leader="dot" w:pos="9360"/>
         </w:tabs>
-        <w:spacing w:before="168" w:after="0" w:line="380" w:lineRule="exact"/>
-        <w:ind w:left="0" w:right="720" w:firstLine="0"/>
+        <w:spacing w:before="140" w:after="0" w:line="322" w:lineRule="exact"/>
+        <w:ind w:left="360" w:right="720" w:hanging="360"/>
       </w:pPr>
       <w:r>
         <w:t xml:space="preserve">Conclusion</w:t>
       </w:r>
       <w:r>
-        <w:rPr>
-          <w:sz w:val="25"/>
-          <w:szCs w:val="25"/>
-        </w:rPr>
-        <w:t xml:space="preserve">  </w:t>
+        <w:t xml:space="preserve">   </w:t>
       </w:r>
       <w:r>
         <w:tab/>
@@ -1163,13 +1228,18 @@
       <w:r>
         <w:t xml:space="preserve">10</w:t>
       </w:r>
+    </w:p>
+    <w:p>
+      <w:pPr>
+        <w:pageBreakBefore/>
+        <w:spacing w:before="0" w:after="0" w:line="1" w:lineRule="exact"/>
+      </w:pPr>
     </w:p>
     <w:p>
       <w:pPr>
         <w:keepNext/>
         <w:keepLines/>
-        <w:pageBreakBefore/>
-        <w:spacing w:before="0" w:after="280" w:line="380" w:lineRule="exact"/>
+        <w:spacing w:before="0" w:after="336" w:line="322" w:lineRule="exact"/>
         <w:ind w:left="0" w:firstLine="0"/>
         <w:jc w:val="center"/>
       </w:pPr>
@@ -1178,15 +1248,47 @@
           <w:b/>
           <w:bCs/>
         </w:rPr>
-        <w:t xml:space="preserve">TABLE OF AUTHORITIES</w:t>
+        <w:t xml:space="preserve">TABLE</w:t>
+      </w:r>
+      <w:r>
+        <w:rPr>
+          <w:b/>
+          <w:bCs/>
+        </w:rPr>
+        <w:t xml:space="preserve"> </w:t>
+      </w:r>
+      <w:r>
+        <w:rPr>
+          <w:b/>
+          <w:bCs/>
+        </w:rPr>
+        <w:t xml:space="preserve">OF</w:t>
+      </w:r>
+      <w:r>
+        <w:rPr>
+          <w:b/>
+          <w:bCs/>
+        </w:rPr>
+        <w:t xml:space="preserve"> </w:t>
+      </w:r>
+      <w:r>
+        <w:rPr>
+          <w:b/>
+          <w:bCs/>
+        </w:rPr>
+        <w:t xml:space="preserve">AUTHORITIES</w:t>
       </w:r>
     </w:p>
     <w:p>
       <w:pPr>
         <w:keepNext/>
         <w:keepLines/>
-        <w:spacing w:before="0" w:after="0" w:line="380" w:lineRule="exact"/>
+        <w:tabs>
+          <w:tab w:val="right" w:pos="9360"/>
+        </w:tabs>
+        <w:spacing w:before="280" w:after="84" w:line="322" w:lineRule="exact"/>
         <w:ind w:left="0" w:firstLine="0"/>
+        <w:jc w:val="left"/>
       </w:pPr>
       <w:r>
         <w:rPr>
@@ -1195,12 +1297,29 @@
         </w:rPr>
         <w:t xml:space="preserve">Cases</w:t>
       </w:r>
+      <w:r>
+        <w:rPr>
+          <w:b/>
+          <w:bCs/>
+        </w:rPr>
+        <w:tab/>
+      </w:r>
+      <w:r>
+        <w:rPr>
+          <w:b/>
+          <w:bCs/>
+        </w:rPr>
+        <w:t xml:space="preserve">Page(s)</w:t>
+      </w:r>
     </w:p>
     <w:p>
       <w:pPr>
         <w:keepLines/>
-        <w:spacing w:before="140" w:after="0" w:line="380" w:lineRule="exact"/>
-        <w:ind w:left="720" w:hanging="720"/>
+        <w:tabs>
+          <w:tab w:val="right" w:leader="dot" w:pos="9360"/>
+        </w:tabs>
+        <w:spacing w:before="84" w:after="0" w:line="322" w:lineRule="exact"/>
+        <w:ind w:left="360" w:right="1120" w:hanging="360"/>
       </w:pPr>
       <w:r>
         <w:rPr>
@@ -1238,7 +1357,10 @@
         <w:t xml:space="preserve">Benevento</w:t>
       </w:r>
       <w:r>
-        <w:t xml:space="preserve">, </w:t>
+        <w:t xml:space="preserve">,</w:t>
+      </w:r>
+      <w:r>
+        <w:t xml:space="preserve"> </w:t>
       </w:r>
       <w:r>
         <w:t xml:space="preserve">91</w:t>
@@ -1261,12 +1383,24 @@
       <w:r>
         <w:t xml:space="preserve">(1998)</w:t>
       </w:r>
+      <w:r>
+        <w:t xml:space="preserve">   </w:t>
+      </w:r>
+      <w:r>
+        <w:tab/>
+      </w:r>
+      <w:r>
+        <w:t xml:space="preserve">8</w:t>
+      </w:r>
     </w:p>
     <w:p>
       <w:pPr>
         <w:keepLines/>
-        <w:spacing w:before="140" w:after="0" w:line="380" w:lineRule="exact"/>
-        <w:ind w:left="720" w:hanging="720"/>
+        <w:tabs>
+          <w:tab w:val="right" w:leader="dot" w:pos="9360"/>
+        </w:tabs>
+        <w:spacing w:before="84" w:after="0" w:line="322" w:lineRule="exact"/>
+        <w:ind w:left="360" w:right="1120" w:hanging="360"/>
       </w:pPr>
       <w:r>
         <w:rPr>
@@ -1304,7 +1438,10 @@
         <w:t xml:space="preserve">Boone</w:t>
       </w:r>
       <w:r>
-        <w:t xml:space="preserve">, </w:t>
+        <w:t xml:space="preserve">,</w:t>
+      </w:r>
+      <w:r>
+        <w:t xml:space="preserve"> </w:t>
       </w:r>
       <w:r>
         <w:t xml:space="preserve">30</w:t>
@@ -1327,12 +1464,24 @@
       <w:r>
         <w:t xml:space="preserve">(2017)</w:t>
       </w:r>
+      <w:r>
+        <w:t xml:space="preserve">   </w:t>
+      </w:r>
+      <w:r>
+        <w:tab/>
+      </w:r>
+      <w:r>
+        <w:t xml:space="preserve">4, 5, 9</w:t>
+      </w:r>
     </w:p>
     <w:p>
       <w:pPr>
         <w:keepLines/>
-        <w:spacing w:before="140" w:after="0" w:line="380" w:lineRule="exact"/>
-        <w:ind w:left="720" w:hanging="720"/>
+        <w:tabs>
+          <w:tab w:val="right" w:leader="dot" w:pos="9360"/>
+        </w:tabs>
+        <w:spacing w:before="84" w:after="0" w:line="322" w:lineRule="exact"/>
+        <w:ind w:left="360" w:right="1120" w:hanging="360"/>
       </w:pPr>
       <w:r>
         <w:rPr>
@@ -1370,7 +1519,10 @@
         <w:t xml:space="preserve">Hobot</w:t>
       </w:r>
       <w:r>
-        <w:t xml:space="preserve">, </w:t>
+        <w:t xml:space="preserve">,</w:t>
+      </w:r>
+      <w:r>
+        <w:t xml:space="preserve"> </w:t>
       </w:r>
       <w:r>
         <w:t xml:space="preserve">84</w:t>
@@ -1393,12 +1545,24 @@
       <w:r>
         <w:t xml:space="preserve">(1995)</w:t>
       </w:r>
+      <w:r>
+        <w:t xml:space="preserve">   </w:t>
+      </w:r>
+      <w:r>
+        <w:tab/>
+      </w:r>
+      <w:r>
+        <w:t xml:space="preserve">8</w:t>
+      </w:r>
     </w:p>
     <w:p>
       <w:pPr>
         <w:keepLines/>
-        <w:spacing w:before="140" w:after="0" w:line="380" w:lineRule="exact"/>
-        <w:ind w:left="720" w:hanging="720"/>
+        <w:tabs>
+          <w:tab w:val="right" w:leader="dot" w:pos="9360"/>
+        </w:tabs>
+        <w:spacing w:before="84" w:after="0" w:line="322" w:lineRule="exact"/>
+        <w:ind w:left="360" w:right="1120" w:hanging="360"/>
       </w:pPr>
       <w:r>
         <w:rPr>
@@ -1433,38 +1597,65 @@
           <w:i/>
           <w:iCs/>
         </w:rPr>
-        <w:t xml:space="preserve">Love</w:t>
-      </w:r>
-      <w:r>
-        <w:t xml:space="preserve">, </w:t>
-      </w:r>
-      <w:r>
-        <w:t xml:space="preserve">57</w:t>
-      </w:r>
-      <w:r>
-        <w:t xml:space="preserve"> </w:t>
-      </w:r>
-      <w:r>
-        <w:t xml:space="preserve">N.Y.2d</w:t>
-      </w:r>
-      <w:r>
-        <w:t xml:space="preserve"> </w:t>
-      </w:r>
-      <w:r>
-        <w:t xml:space="preserve">998</w:t>
-      </w:r>
-      <w:r>
-        <w:t xml:space="preserve"> </w:t>
-      </w:r>
-      <w:r>
-        <w:t xml:space="preserve">(1982)</w:t>
+        <w:t xml:space="preserve">Watkins</w:t>
+      </w:r>
+      <w:r>
+        <w:t xml:space="preserve">,</w:t>
+      </w:r>
+      <w:r>
+        <w:t xml:space="preserve"> </w:t>
+      </w:r>
+      <w:r>
+        <w:t xml:space="preserve">206</w:t>
+      </w:r>
+      <w:r>
+        <w:t xml:space="preserve"> </w:t>
+      </w:r>
+      <w:r>
+        <w:t xml:space="preserve">A.D.3d</w:t>
+      </w:r>
+      <w:r>
+        <w:t xml:space="preserve"> </w:t>
+      </w:r>
+      <w:r>
+        <w:t xml:space="preserve">452</w:t>
+      </w:r>
+      <w:r>
+        <w:t xml:space="preserve"> </w:t>
+      </w:r>
+      <w:r>
+        <w:t xml:space="preserve">(1st</w:t>
+      </w:r>
+      <w:r>
+        <w:t xml:space="preserve"> </w:t>
+      </w:r>
+      <w:r>
+        <w:t xml:space="preserve">Dept.</w:t>
+      </w:r>
+      <w:r>
+        <w:t xml:space="preserve"> </w:t>
+      </w:r>
+      <w:r>
+        <w:t xml:space="preserve">2022)</w:t>
+      </w:r>
+      <w:r>
+        <w:t xml:space="preserve">   </w:t>
+      </w:r>
+      <w:r>
+        <w:tab/>
+      </w:r>
+      <w:r>
+        <w:t xml:space="preserve">3</w:t>
       </w:r>
     </w:p>
     <w:p>
       <w:pPr>
         <w:keepLines/>
-        <w:spacing w:before="140" w:after="0" w:line="380" w:lineRule="exact"/>
-        <w:ind w:left="720" w:hanging="720"/>
+        <w:tabs>
+          <w:tab w:val="right" w:leader="dot" w:pos="9360"/>
+        </w:tabs>
+        <w:spacing w:before="84" w:after="0" w:line="322" w:lineRule="exact"/>
+        <w:ind w:left="360" w:right="1120" w:hanging="360"/>
       </w:pPr>
       <w:r>
         <w:rPr>
@@ -1499,45 +1690,60 @@
           <w:i/>
           <w:iCs/>
         </w:rPr>
-        <w:t xml:space="preserve">Rivera</w:t>
-      </w:r>
-      <w:r>
-        <w:t xml:space="preserve">, </w:t>
-      </w:r>
-      <w:r>
-        <w:t xml:space="preserve">71</w:t>
-      </w:r>
-      <w:r>
-        <w:t xml:space="preserve"> </w:t>
-      </w:r>
-      <w:r>
-        <w:t xml:space="preserve">N.Y.2d</w:t>
-      </w:r>
-      <w:r>
-        <w:t xml:space="preserve"> </w:t>
-      </w:r>
-      <w:r>
-        <w:t xml:space="preserve">705</w:t>
-      </w:r>
-      <w:r>
-        <w:t xml:space="preserve"> </w:t>
-      </w:r>
-      <w:r>
-        <w:t xml:space="preserve">(1988)</w:t>
+        <w:t xml:space="preserve">Wragg</w:t>
+      </w:r>
+      <w:r>
+        <w:t xml:space="preserve">,</w:t>
+      </w:r>
+      <w:r>
+        <w:t xml:space="preserve"> </w:t>
+      </w:r>
+      <w:r>
+        <w:t xml:space="preserve">26</w:t>
+      </w:r>
+      <w:r>
+        <w:t xml:space="preserve"> </w:t>
+      </w:r>
+      <w:r>
+        <w:t xml:space="preserve">N.Y.3d</w:t>
+      </w:r>
+      <w:r>
+        <w:t xml:space="preserve"> </w:t>
+      </w:r>
+      <w:r>
+        <w:t xml:space="preserve">403</w:t>
+      </w:r>
+      <w:r>
+        <w:t xml:space="preserve"> </w:t>
+      </w:r>
+      <w:r>
+        <w:t xml:space="preserve">(2015)</w:t>
+      </w:r>
+      <w:r>
+        <w:t xml:space="preserve">   </w:t>
+      </w:r>
+      <w:r>
+        <w:tab/>
+      </w:r>
+      <w:r>
+        <w:t xml:space="preserve">8</w:t>
       </w:r>
     </w:p>
     <w:p>
       <w:pPr>
         <w:keepLines/>
-        <w:spacing w:before="140" w:after="0" w:line="380" w:lineRule="exact"/>
-        <w:ind w:left="720" w:hanging="720"/>
+        <w:tabs>
+          <w:tab w:val="right" w:leader="dot" w:pos="9360"/>
+        </w:tabs>
+        <w:spacing w:before="84" w:after="0" w:line="322" w:lineRule="exact"/>
+        <w:ind w:left="360" w:right="1120" w:hanging="360"/>
       </w:pPr>
       <w:r>
         <w:rPr>
           <w:i/>
           <w:iCs/>
         </w:rPr>
-        <w:t xml:space="preserve">People</w:t>
+        <w:t xml:space="preserve">Strickland</w:t>
       </w:r>
       <w:r>
         <w:rPr>
@@ -1565,154 +1771,13 @@
           <w:i/>
           <w:iCs/>
         </w:rPr>
-        <w:t xml:space="preserve">Watkins</w:t>
-      </w:r>
-      <w:r>
-        <w:t xml:space="preserve">, </w:t>
-      </w:r>
-      <w:r>
-        <w:t xml:space="preserve">206</w:t>
-      </w:r>
-      <w:r>
-        <w:t xml:space="preserve"> </w:t>
-      </w:r>
-      <w:r>
-        <w:t xml:space="preserve">A.D.3d</w:t>
-      </w:r>
-      <w:r>
-        <w:t xml:space="preserve"> </w:t>
-      </w:r>
-      <w:r>
-        <w:t xml:space="preserve">452</w:t>
-      </w:r>
-      <w:r>
-        <w:t xml:space="preserve"> </w:t>
-      </w:r>
-      <w:r>
-        <w:t xml:space="preserve">(1st</w:t>
-      </w:r>
-      <w:r>
-        <w:t xml:space="preserve"> </w:t>
-      </w:r>
-      <w:r>
-        <w:t xml:space="preserve">Dept.</w:t>
-      </w:r>
-      <w:r>
-        <w:t xml:space="preserve"> </w:t>
-      </w:r>
-      <w:r>
-        <w:t xml:space="preserve">2022)</w:t>
-      </w:r>
-    </w:p>
-    <w:p>
-      <w:pPr>
-        <w:keepLines/>
-        <w:spacing w:before="140" w:after="0" w:line="380" w:lineRule="exact"/>
-        <w:ind w:left="720" w:hanging="720"/>
-      </w:pPr>
-      <w:r>
-        <w:rPr>
-          <w:i/>
-          <w:iCs/>
-        </w:rPr>
-        <w:t xml:space="preserve">People</w:t>
-      </w:r>
-      <w:r>
-        <w:rPr>
-          <w:i/>
-          <w:iCs/>
-        </w:rPr>
-        <w:t xml:space="preserve"> </w:t>
-      </w:r>
-      <w:r>
-        <w:rPr>
-          <w:i/>
-          <w:iCs/>
-        </w:rPr>
-        <w:t xml:space="preserve">v.</w:t>
-      </w:r>
-      <w:r>
-        <w:rPr>
-          <w:i/>
-          <w:iCs/>
-        </w:rPr>
-        <w:t xml:space="preserve"> </w:t>
-      </w:r>
-      <w:r>
-        <w:rPr>
-          <w:i/>
-          <w:iCs/>
-        </w:rPr>
-        <w:t xml:space="preserve">Wragg</w:t>
-      </w:r>
-      <w:r>
-        <w:t xml:space="preserve">, </w:t>
-      </w:r>
-      <w:r>
-        <w:t xml:space="preserve">26</w:t>
-      </w:r>
-      <w:r>
-        <w:t xml:space="preserve"> </w:t>
-      </w:r>
-      <w:r>
-        <w:t xml:space="preserve">N.Y.3d</w:t>
-      </w:r>
-      <w:r>
-        <w:t xml:space="preserve"> </w:t>
-      </w:r>
-      <w:r>
-        <w:t xml:space="preserve">403</w:t>
-      </w:r>
-      <w:r>
-        <w:t xml:space="preserve"> </w:t>
-      </w:r>
-      <w:r>
-        <w:t xml:space="preserve">(2015)</w:t>
-      </w:r>
-    </w:p>
-    <w:p>
-      <w:pPr>
-        <w:keepLines/>
-        <w:spacing w:before="140" w:after="0" w:line="380" w:lineRule="exact"/>
-        <w:ind w:left="720" w:hanging="720"/>
-      </w:pPr>
-      <w:r>
-        <w:rPr>
-          <w:i/>
-          <w:iCs/>
-        </w:rPr>
-        <w:t xml:space="preserve">Strickland</w:t>
-      </w:r>
-      <w:r>
-        <w:rPr>
-          <w:i/>
-          <w:iCs/>
-        </w:rPr>
-        <w:t xml:space="preserve"> </w:t>
-      </w:r>
-      <w:r>
-        <w:rPr>
-          <w:i/>
-          <w:iCs/>
-        </w:rPr>
-        <w:t xml:space="preserve">v.</w:t>
-      </w:r>
-      <w:r>
-        <w:rPr>
-          <w:i/>
-          <w:iCs/>
-        </w:rPr>
-        <w:t xml:space="preserve"> </w:t>
-      </w:r>
-      <w:r>
-        <w:rPr>
-          <w:i/>
-          <w:iCs/>
-        </w:rPr>
         <w:t xml:space="preserve">Washington</w:t>
       </w:r>
       <w:r>
-        <w:t xml:space="preserve">, </w:t>
+        <w:t xml:space="preserve">,</w:t>
+      </w:r>
+      <w:r>
+        <w:t xml:space="preserve"> </w:t>
       </w:r>
       <w:r>
         <w:t xml:space="preserve">466</w:t>
@@ -1734,14 +1799,24 @@
       </w:r>
       <w:r>
         <w:t xml:space="preserve">(1984)</w:t>
+      </w:r>
+      <w:r>
+        <w:t xml:space="preserve">   </w:t>
+      </w:r>
+      <w:r>
+        <w:tab/>
+      </w:r>
+      <w:r>
+        <w:t xml:space="preserve">8</w:t>
       </w:r>
     </w:p>
     <w:p>
       <w:pPr>
         <w:keepNext/>
         <w:keepLines/>
-        <w:spacing w:before="380" w:after="0" w:line="380" w:lineRule="exact"/>
+        <w:spacing w:before="280" w:after="84" w:line="322" w:lineRule="exact"/>
         <w:ind w:left="0" w:firstLine="0"/>
+        <w:jc w:val="left"/>
       </w:pPr>
       <w:r>
         <w:rPr>
@@ -1754,8 +1829,11 @@
     <w:p>
       <w:pPr>
         <w:keepLines/>
-        <w:spacing w:before="140" w:after="0" w:line="380" w:lineRule="exact"/>
-        <w:ind w:left="720" w:hanging="720"/>
+        <w:tabs>
+          <w:tab w:val="right" w:leader="dot" w:pos="9360"/>
+        </w:tabs>
+        <w:spacing w:before="84" w:after="0" w:line="322" w:lineRule="exact"/>
+        <w:ind w:left="360" w:right="1120" w:hanging="360"/>
       </w:pPr>
       <w:r>
         <w:t xml:space="preserve">Penal</w:t>
@@ -1764,10 +1842,10 @@
         <w:t xml:space="preserve"> </w:t>
       </w:r>
       <w:r>
-        <w:t xml:space="preserve">Law</w:t>
-      </w:r>
-      <w:r>
-        <w:t xml:space="preserve">, </w:t>
+        <w:t xml:space="preserve">Law,</w:t>
+      </w:r>
+      <w:r>
+        <w:t xml:space="preserve"> </w:t>
       </w:r>
       <w:r>
         <w:t xml:space="preserve">§</w:t>
@@ -1778,12 +1856,24 @@
       <w:r>
         <w:t xml:space="preserve">110.00</w:t>
       </w:r>
+      <w:r>
+        <w:t xml:space="preserve">   </w:t>
+      </w:r>
+      <w:r>
+        <w:tab/>
+      </w:r>
+      <w:r>
+        <w:t xml:space="preserve">1</w:t>
+      </w:r>
     </w:p>
     <w:p>
       <w:pPr>
         <w:keepLines/>
-        <w:spacing w:before="140" w:after="0" w:line="380" w:lineRule="exact"/>
-        <w:ind w:left="720" w:hanging="720"/>
+        <w:tabs>
+          <w:tab w:val="right" w:leader="dot" w:pos="9360"/>
+        </w:tabs>
+        <w:spacing w:before="84" w:after="0" w:line="322" w:lineRule="exact"/>
+        <w:ind w:left="360" w:right="1120" w:hanging="360"/>
       </w:pPr>
       <w:r>
         <w:t xml:space="preserve">Penal</w:t>
@@ -1792,10 +1882,10 @@
         <w:t xml:space="preserve"> </w:t>
       </w:r>
       <w:r>
-        <w:t xml:space="preserve">Law</w:t>
-      </w:r>
-      <w:r>
-        <w:t xml:space="preserve">, </w:t>
+        <w:t xml:space="preserve">Law,</w:t>
+      </w:r>
+      <w:r>
+        <w:t xml:space="preserve"> </w:t>
       </w:r>
       <w:r>
         <w:t xml:space="preserve">§</w:t>
@@ -1806,24 +1896,32 @@
       <w:r>
         <w:t xml:space="preserve">120.10(1)</w:t>
       </w:r>
-    </w:p>
-    <w:p>
-      <w:pPr>
-        <w:spacing w:before="0" w:after="0" w:line="20" w:lineRule="exact"/>
+      <w:r>
+        <w:t xml:space="preserve">   </w:t>
+      </w:r>
+      <w:r>
+        <w:tab/>
+      </w:r>
+      <w:r>
+        <w:t xml:space="preserve">1</w:t>
+      </w:r>
+    </w:p>
+    <w:p>
+      <w:pPr>
+        <w:spacing w:before="0" w:after="0" w:line="1" w:lineRule="exact"/>
         <w:sectPr>
-          <w:footerReference w:type="default" r:id="rIdFtrPage"/>
+          <w:footerReference w:type="default" r:id="rIdXdPage"/>
           <w:pgSz w:w="12240" w:h="15840"/>
-          <w:pgMar w:top="1440" w:right="1440" w:bottom="1440" w:left="1440" w:header="720" w:footer="644" w:gutter="0"/>
-          <w:pgNumType w:fmt="lowerRoman" w:start="2"/>
+          <w:pgMar w:top="1440" w:right="1440" w:bottom="1440" w:left="1440" w:header="720" w:footer="686" w:gutter="0"/>
+          <w:pgNumType w:fmt="lowerRoman"/>
         </w:sectPr>
       </w:pPr>
     </w:p>
     <w:p>
       <w:pPr>
-        <w:pStyle w:val="Heading1"/>
         <w:keepNext/>
         <w:keepLines/>
-        <w:spacing w:before="0" w:after="336" w:line="380" w:lineRule="exact"/>
+        <w:spacing w:before="0" w:after="336" w:line="322" w:lineRule="exact"/>
         <w:ind w:left="0" w:firstLine="0"/>
         <w:jc w:val="center"/>
       </w:pPr>
@@ -1851,17 +1949,26 @@
     </w:p>
     <w:p>
       <w:pPr>
-        <w:pStyle w:val="FirstParagraph"/>
-      </w:pPr>
-      <w:r>
-        <w:t xml:space="preserve">By permission of the Honorable Shirley Troutman, Associate Judge of the Court of Appeals, defendant Mark Watkins appeals from a June 9, 2022 order of the Appellate Division, First Department. By that order, the Appellate Division unanimously affirmed a March 26, 2018 judgment of the Supreme Court, New York County, convicting defendant, after a jury trial, of Attempted Assault in the First Degree (Penal Law §§ 110.00, 120.10[1]), Assault in the Second Degree (Penal Law § 120.05[2]), and Criminal Possession of a Weapon in the Third Degree (Penal Law § 265.02[1]). Defendant was sentenced, as a second violent felony offender, to an aggregate term of 13 years in prison to be followed by five years of post-release supervision. He is currently incarcerated pursuant to that judgment.</w:t>
-      </w:r>
-    </w:p>
-    <w:p>
-      <w:pPr>
         <w:pStyle w:val="BodyText"/>
       </w:pPr>
       <w:r>
+        <w:t xml:space="preserve">By permission of the Honorable Shirley Troutman, Associate Judge of the Court of Appeals, defendant Mark Watkins appeals from a June 9, 2022 order of the Appellate Division, First Department. By that order, the Appellate Division unanimously affirmed a March 26, 2018 judgment of the Supreme Court, New York County, convicting defendant, after a jury trial, of Attempted Assault in the First Degree (Penal</w:t>
+      </w:r>
+      <w:r>
+        <w:t xml:space="preserve"> </w:t>
+      </w:r>
+      <w:r>
+        <w:t xml:space="preserve">Law §§ 110.00, 120.10[1]</w:t>
+      </w:r>
+      <w:r>
+        <w:t xml:space="preserve">), Assault in the Second Degree (Penal Law § 120.05[2]), and Criminal Possession of a Weapon in the Third Degree (Penal Law § 265.02[1]). Defendant was sentenced, as a second violent felony offender, to an aggregate term of 13 years in prison to be followed by five years of post-release supervision. He is currently incarcerated pursuant to that judgment.</w:t>
+      </w:r>
+    </w:p>
+    <w:p>
+      <w:pPr>
+        <w:pStyle w:val="BodyText"/>
+      </w:pPr>
+      <w:r>
         <w:t xml:space="preserve">The judgment arose from an attack that occurred at about 1:00 p.m. on October 7, 2016, on East 103rd Street in the East Harlem neighborhood of Manhattan. Defendant, who is Black, approached 65-year-old David Pena, a non-Black Hispanic who was a 25-year resident of East Harlem, and punched Pena in the face with his right hand while clutching a hard object, fracturing Pena’s left orbital bone. During the subsequent interaction, Pena looked at defendant’s face for about 10 seconds from a distance of approximately 10 to 15 feet before defendant walked away.</w:t>
       </w:r>
     </w:p>
@@ -1886,7 +1993,16 @@
         <w:pStyle w:val="BodyText"/>
       </w:pPr>
       <w:r>
-        <w:t xml:space="preserve">The Appellate Division, First Department affirmed, rejecting defendant’s argument that his trial attorney had been ineffective for failing to request a cross-racial identification charge. The court found that defendant’s ineffective-assistance claim was unreviewable on direct appeal because it involved “matters not fully explained by the record.” People v. Watkins, 206 A.D.3d 452, 453 (1st Dept. 2022). In the alternative, the court rejected defendant’s claim on the merits, concluding that he had shown neither that “it was objectively unreasonable for counsel to refrain from requesting a jury charge on cross-racial identification,” nor that “such a request would have been granted at the time of the trial, or that the absence of such a charge affected the outcome of the case.” Watkins, 206 A.D.3d at 453.</w:t>
+        <w:t xml:space="preserve">The Appellate Division, First Department affirmed, rejecting defendant’s argument that his trial attorney had been ineffective for failing to request a cross-racial identification charge. The court found that defendant’s ineffective-assistance claim was unreviewable on direct appeal because it involved “matters not fully explained by the record.” People</w:t>
+      </w:r>
+      <w:r>
+        <w:t xml:space="preserve"> </w:t>
+      </w:r>
+      <w:r>
+        <w:t xml:space="preserve">v. Watkins, 206 A.D.3d 452, 453 (1st Dept. 2022). In the alternative, the court rejected defendant’s claim on the merits, concluding that he had shown neither that “it was objectively unreasonable for counsel to refrain from requesting a jury charge on cross-racial identification,” nor that “such a request would have been granted at the time of the trial, or that the absence of such a charge affected the outcome of the case.” Watkins</w:t>
+      </w:r>
+      <w:r>
+        <w:t xml:space="preserve">, 206 A.D.3d at 453.</w:t>
       </w:r>
     </w:p>
     <w:p>
@@ -1902,7 +2018,13 @@
         <w:pStyle w:val="BodyText"/>
       </w:pPr>
       <w:r>
-        <w:t xml:space="preserve">Defendant’s categorical argument is inconsistent with this Court’s well-established ineffective-assistance precedents. When a defendant challenges his counsel’s performance as ineffective based on a single alleged error, the error must be so egregious, clear-cut, and completely dispositive in light of the record that no reasonable attorney would have made it. Here, there was no clear legal or factual support for requesting a cross-racial identification charge at the time of defendant’s trial. As a legal matter, this Court had not yet decided People v. Boone, 30 N.Y.3d 521 (2017), which for the first time held that a cross-racial identification charge was available upon demand. As a factual matter, the record developed at trial included concrete evidence that the eyewitness, Pena, had no difficulty making this cross-racial identification. Reasonable defense counsel could thus have concluded that any challenge to Pena’s identification on cross-racial grounds was so weak as to not be worth making, especially in comparison to other, stronger challenges.</w:t>
+        <w:t xml:space="preserve">Defendant’s categorical argument is inconsistent with this Court’s well-established ineffective-assistance precedents. When a defendant challenges his counsel’s performance as ineffective based on a single alleged error, the error must be so egregious, clear-cut, and completely dispositive in light of the record that no reasonable attorney would have made it. Here, there was no clear legal or factual support for requesting a cross-racial identification charge at the time of defendant’s trial. As a legal matter, this Court had not yet decided People</w:t>
+      </w:r>
+      <w:r>
+        <w:t xml:space="preserve"> </w:t>
+      </w:r>
+      <w:r>
+        <w:t xml:space="preserve">v. Boone, 30 N.Y.3d 521 (2017), which for the first time held that a cross-racial identification charge was available upon demand. As a factual matter, the record developed at trial included concrete evidence that the eyewitness, Pena, had no difficulty making this cross-racial identification. Reasonable defense counsel could thus have concluded that any challenge to Pena’s identification on cross-racial grounds was so weak as to not be worth making, especially in comparison to other, stronger challenges.</w:t>
       </w:r>
     </w:p>
     <w:p>
@@ -1918,15 +2040,17 @@
         <w:pStyle w:val="BodyText"/>
       </w:pPr>
       <w:r>
-        <w:t xml:space="preserve">Finally, even if counsel should have requested the charge, his failure to do so did not prejudice the defense or deprive defendant of a fair trial. As the Appellate Division correctly concluded, there is no indication that the trial court would have granted such a charge prior to Boone, and even less indication, given the trial record, that the jury would have drawn the adverse inference permitted but not mandated by the cross-racial identification charge.</w:t>
-      </w:r>
-    </w:p>
-    <w:p>
-      <w:pPr>
-        <w:pStyle w:val="Heading1"/>
+        <w:t xml:space="preserve">Finally, even if counsel should have requested the charge, his failure to do so did not prejudice the defense or deprive defendant of a fair trial. As the Appellate Division correctly concluded, there is no indication that the trial court would have granted such a charge prior to Boone</w:t>
+      </w:r>
+      <w:r>
+        <w:t xml:space="preserve">, and even less indication, given the trial record, that the jury would have drawn the adverse inference permitted but not mandated by the cross-racial identification charge.</w:t>
+      </w:r>
+    </w:p>
+    <w:p>
+      <w:pPr>
         <w:keepNext/>
         <w:keepLines/>
-        <w:spacing w:before="392" w:after="336" w:line="380" w:lineRule="exact"/>
+        <w:spacing w:before="392" w:after="336" w:line="322" w:lineRule="exact"/>
         <w:ind w:left="0" w:firstLine="0"/>
         <w:jc w:val="center"/>
       </w:pPr>
@@ -1962,10 +2086,9 @@
     </w:p>
     <w:p>
       <w:pPr>
-        <w:pStyle w:val="Heading1"/>
         <w:keepNext/>
         <w:keepLines/>
-        <w:spacing w:before="392" w:after="336" w:line="380" w:lineRule="exact"/>
+        <w:spacing w:before="392" w:after="336" w:line="322" w:lineRule="exact"/>
         <w:ind w:left="0" w:firstLine="0"/>
         <w:jc w:val="center"/>
       </w:pPr>
@@ -2021,10 +2144,9 @@
     </w:p>
     <w:p>
       <w:pPr>
-        <w:pStyle w:val="Heading2"/>
         <w:keepNext/>
         <w:keepLines/>
-        <w:spacing w:before="336" w:after="252" w:line="380" w:lineRule="exact"/>
+        <w:spacing w:before="336" w:after="252" w:line="322" w:lineRule="exact"/>
         <w:ind w:left="0" w:firstLine="0"/>
         <w:jc w:val="left"/>
       </w:pPr>
@@ -2094,10 +2216,9 @@
     </w:p>
     <w:p>
       <w:pPr>
-        <w:pStyle w:val="Heading3"/>
         <w:keepNext/>
         <w:keepLines/>
-        <w:spacing w:before="364" w:after="308" w:line="380" w:lineRule="exact"/>
+        <w:spacing w:before="364" w:after="308" w:line="322" w:lineRule="exact"/>
         <w:ind w:left="720" w:firstLine="0"/>
         <w:jc w:val="left"/>
       </w:pPr>
@@ -2361,10 +2482,9 @@
     </w:p>
     <w:p>
       <w:pPr>
-        <w:pStyle w:val="Heading1"/>
         <w:keepNext/>
         <w:keepLines/>
-        <w:spacing w:before="392" w:after="336" w:line="380" w:lineRule="exact"/>
+        <w:spacing w:before="392" w:after="336" w:line="322" w:lineRule="exact"/>
         <w:ind w:left="0" w:firstLine="0"/>
         <w:jc w:val="center"/>
       </w:pPr>
@@ -2465,7 +2585,13 @@
         <w:pStyle w:val="BodyText"/>
       </w:pPr>
       <w:r>
-        <w:t xml:space="preserve">To establish an ineffective assistance claim under the United States Constitution, a defendant must first demonstrate that his counsel’s performance was so deficient that the attorney was not functioning as the professional counsel guaranteed by the Sixth Amendment. That demonstration must overcome the strong presumption that counsel’s conduct fell “within the wide range of reasonable professional assistance” appropriate under the circumstances of the case. Strickland v. Washington, 466 U.S. 668, 689</w:t>
+        <w:t xml:space="preserve">To establish an ineffective assistance claim under the United States Constitution, a defendant must first demonstrate that his counsel’s performance was so deficient that the attorney was not functioning as the professional counsel guaranteed by the Sixth Amendment. That demonstration must overcome the strong presumption that counsel’s conduct fell “within the wide range of reasonable professional assistance” appropriate under the circumstances of the case. Strickland</w:t>
+      </w:r>
+      <w:r>
+        <w:t xml:space="preserve"> </w:t>
+      </w:r>
+      <w:r>
+        <w:t xml:space="preserve">v. Washington, 466 U.S. 668, 689</w:t>
       </w:r>
       <w:r>
         <w:noBreakHyphen/>
@@ -2479,15 +2605,32 @@
         <w:pStyle w:val="BodyText"/>
       </w:pPr>
       <w:r>
-        <w:t xml:space="preserve">New York law provides a similar two-step standard. On the first prong, as under the federal Constitution, a defendant must show that his counsel’s performance fell below a permissible standard of “meaningful representation” considering the evidence, the law, and the circumstances of the particular case, viewed in their totality. People v. Wragg, 26 N.Y.3d 403, 409 (2015); People v. Benevento, 91 N.Y.2d 708, 712 (1998). An attorney is presumed to have provided meaningful representation. See People v. Hobot, 84 N.Y.2d 1021, 1022 (1995). That presumption can be overcome only if the absence of strategic or other legitimate explanations for counsel’s alleged shortcomings is demonstrated.</w:t>
-      </w:r>
-    </w:p>
-    <w:p>
-      <w:pPr>
-        <w:pStyle w:val="Heading1"/>
+        <w:t xml:space="preserve">New York law provides a similar two-step standard. On the first prong, as under the federal Constitution, a defendant must show that his counsel’s performance fell below a permissible standard of “meaningful representation” considering the evidence, the law, and the circumstances of the particular case, viewed in their totality. People</w:t>
+      </w:r>
+      <w:r>
+        <w:t xml:space="preserve"> </w:t>
+      </w:r>
+      <w:r>
+        <w:t xml:space="preserve">v. Wragg, 26 N.Y.3d 403, 409 (2015); People</w:t>
+      </w:r>
+      <w:r>
+        <w:t xml:space="preserve"> </w:t>
+      </w:r>
+      <w:r>
+        <w:t xml:space="preserve">v. Benevento, 91 N.Y.2d 708, 712 (1998). An attorney is presumed to have provided meaningful representation. See People</w:t>
+      </w:r>
+      <w:r>
+        <w:t xml:space="preserve"> </w:t>
+      </w:r>
+      <w:r>
+        <w:t xml:space="preserve">v. Hobot, 84 N.Y.2d 1021, 1022 (1995). That presumption can be overcome only if the absence of strategic or other legitimate explanations for counsel’s alleged shortcomings is demonstrated.</w:t>
+      </w:r>
+    </w:p>
+    <w:p>
+      <w:pPr>
         <w:keepNext/>
         <w:keepLines/>
-        <w:spacing w:before="392" w:after="336" w:line="380" w:lineRule="exact"/>
+        <w:spacing w:before="392" w:after="336" w:line="322" w:lineRule="exact"/>
         <w:ind w:left="0" w:firstLine="0"/>
         <w:jc w:val="center"/>
       </w:pPr>
@@ -2501,10 +2644,9 @@
     </w:p>
     <w:p>
       <w:pPr>
-        <w:pStyle w:val="Heading2"/>
         <w:keepNext/>
         <w:keepLines/>
-        <w:spacing w:before="336" w:after="252" w:line="380" w:lineRule="exact"/>
+        <w:spacing w:before="336" w:after="252" w:line="322" w:lineRule="exact"/>
         <w:ind w:left="0" w:firstLine="0"/>
         <w:jc w:val="left"/>
       </w:pPr>
@@ -2739,15 +2881,17 @@
         <w:pStyle w:val="BodyText"/>
       </w:pPr>
       <w:r>
-        <w:t xml:space="preserve">There is no such categorical rule. Depending on the circumstances of a case, defense counsel could reasonably decline to request a cross-racial identification charge, including, as here, when there was good reason to believe that the particular witness’s ability to identify defendant was not confounded by defendant’s race. No clear-cut rule at the time of defendant’s trial provided otherwise. Indeed, a rule requiring defense counsel to request a cross-racial identification charge in nearly every case would be inconsistent with this Court’s decision in Boone, which left that strategic choice to defense counsel. Finally, even assuming that counsel’s performance here fell below the constitutional standard for meaningful representation, defendant has not shown that the absence of a request for a cross-racial identification charge caused any prejudice here. This Court should accordingly affirm the decision below.</w:t>
-      </w:r>
-    </w:p>
-    <w:p>
-      <w:pPr>
-        <w:pStyle w:val="Heading1"/>
+        <w:t xml:space="preserve">There is no such categorical rule. Depending on the circumstances of a case, defense counsel could reasonably decline to request a cross-racial identification charge, including, as here, when there was good reason to believe that the particular witness’s ability to identify defendant was not confounded by defendant’s race. No clear-cut rule at the time of defendant’s trial provided otherwise. Indeed, a rule requiring defense counsel to request a cross-racial identification charge in nearly every case would be inconsistent with this Court’s decision in Boone</w:t>
+      </w:r>
+      <w:r>
+        <w:t xml:space="preserve">, which left that strategic choice to defense counsel. Finally, even assuming that counsel’s performance here fell below the constitutional standard for meaningful representation, defendant has not shown that the absence of a request for a cross-racial identification charge caused any prejudice here. This Court should accordingly affirm the decision below.</w:t>
+      </w:r>
+    </w:p>
+    <w:p>
+      <w:pPr>
         <w:keepNext/>
         <w:keepLines/>
-        <w:spacing w:before="392" w:after="336" w:line="380" w:lineRule="exact"/>
+        <w:spacing w:before="392" w:after="336" w:line="322" w:lineRule="exact"/>
         <w:ind w:left="0" w:firstLine="0"/>
         <w:jc w:val="center"/>
       </w:pPr>
@@ -2769,250 +2913,286 @@
     </w:p>
     <w:p>
       <w:pPr>
-        <w:keepNext/>
-        <w:keepLines/>
-        <w:spacing w:before="420" w:after="0" w:line="380" w:lineRule="exact"/>
-        <w:ind w:left="4680" w:firstLine="0"/>
-      </w:pPr>
-      <w:r>
-        <w:t xml:space="preserve">Respectfully submitted,</w:t>
-      </w:r>
-    </w:p>
-    <w:p>
-      <w:pPr>
-        <w:keepNext/>
-        <w:keepLines/>
-        <w:spacing w:before="504" w:after="0" w:line="380" w:lineRule="exact"/>
-        <w:ind w:left="4680" w:firstLine="0"/>
-      </w:pPr>
-      <w:r>
-        <w:t xml:space="preserve">MICHAEL</w:t>
-      </w:r>
-      <w:r>
-        <w:t xml:space="preserve"> </w:t>
-      </w:r>
-      <w:r>
-        <w:t xml:space="preserve">J.</w:t>
-      </w:r>
-      <w:r>
-        <w:t xml:space="preserve"> </w:t>
-      </w:r>
-      <w:r>
-        <w:t xml:space="preserve">YETTER</w:t>
-      </w:r>
-    </w:p>
-    <w:p>
-      <w:pPr>
-        <w:keepNext/>
-        <w:keepLines/>
-        <w:spacing w:before="0" w:after="0" w:line="380" w:lineRule="exact"/>
-        <w:ind w:left="4680" w:firstLine="0"/>
-      </w:pPr>
-      <w:r>
-        <w:rPr>
-          <w:i/>
-          <w:iCs/>
-        </w:rPr>
-        <w:t xml:space="preserve">Assistant</w:t>
-      </w:r>
-      <w:r>
-        <w:rPr>
-          <w:i/>
-          <w:iCs/>
-        </w:rPr>
-        <w:t xml:space="preserve"> </w:t>
-      </w:r>
-      <w:r>
-        <w:rPr>
-          <w:i/>
-          <w:iCs/>
-        </w:rPr>
-        <w:t xml:space="preserve">District</w:t>
-      </w:r>
-      <w:r>
-        <w:rPr>
-          <w:i/>
-          <w:iCs/>
-        </w:rPr>
-        <w:t xml:space="preserve"> </w:t>
-      </w:r>
-      <w:r>
-        <w:rPr>
-          <w:i/>
-          <w:iCs/>
-        </w:rPr>
-        <w:t xml:space="preserve">Attorney</w:t>
-      </w:r>
-    </w:p>
-    <w:p>
-      <w:pPr>
-        <w:keepNext/>
-        <w:keepLines/>
-        <w:spacing w:before="0" w:after="0" w:line="380" w:lineRule="exact"/>
-        <w:ind w:left="4680" w:firstLine="0"/>
-      </w:pPr>
-      <w:r>
-        <w:rPr>
-          <w:i/>
-          <w:iCs/>
-        </w:rPr>
-        <w:t xml:space="preserve">for</w:t>
-      </w:r>
-      <w:r>
-        <w:rPr>
-          <w:i/>
-          <w:iCs/>
-        </w:rPr>
-        <w:t xml:space="preserve"> </w:t>
-      </w:r>
-      <w:r>
-        <w:rPr>
-          <w:i/>
-          <w:iCs/>
-        </w:rPr>
-        <w:t xml:space="preserve">Alvin</w:t>
-      </w:r>
-      <w:r>
-        <w:rPr>
-          <w:i/>
-          <w:iCs/>
-        </w:rPr>
-        <w:t xml:space="preserve"> </w:t>
-      </w:r>
-      <w:r>
-        <w:rPr>
-          <w:i/>
-          <w:iCs/>
-        </w:rPr>
-        <w:t xml:space="preserve">L.</w:t>
-      </w:r>
-      <w:r>
-        <w:rPr>
-          <w:i/>
-          <w:iCs/>
-        </w:rPr>
-        <w:t xml:space="preserve"> </w:t>
-      </w:r>
-      <w:r>
-        <w:rPr>
-          <w:i/>
-          <w:iCs/>
-        </w:rPr>
-        <w:t xml:space="preserve">Bragg,</w:t>
-      </w:r>
-      <w:r>
-        <w:rPr>
-          <w:i/>
-          <w:iCs/>
-        </w:rPr>
-        <w:t xml:space="preserve"> </w:t>
-      </w:r>
-      <w:r>
-        <w:rPr>
-          <w:i/>
-          <w:iCs/>
-        </w:rPr>
-        <w:t xml:space="preserve">Jr.,</w:t>
-      </w:r>
-      <w:r>
-        <w:rPr>
-          <w:i/>
-          <w:iCs/>
-        </w:rPr>
-        <w:t xml:space="preserve"> </w:t>
-      </w:r>
-      <w:r>
-        <w:rPr>
-          <w:i/>
-          <w:iCs/>
-        </w:rPr>
-        <w:t xml:space="preserve">District</w:t>
-      </w:r>
-      <w:r>
-        <w:rPr>
-          <w:i/>
-          <w:iCs/>
-        </w:rPr>
-        <w:t xml:space="preserve"> </w:t>
-      </w:r>
-      <w:r>
-        <w:rPr>
-          <w:i/>
-          <w:iCs/>
-        </w:rPr>
-        <w:t xml:space="preserve">Attorney,</w:t>
-      </w:r>
-      <w:r>
-        <w:rPr>
-          <w:i/>
-          <w:iCs/>
-        </w:rPr>
-        <w:t xml:space="preserve"> </w:t>
-      </w:r>
-      <w:r>
-        <w:rPr>
-          <w:i/>
-          <w:iCs/>
-        </w:rPr>
-        <w:t xml:space="preserve">New</w:t>
-      </w:r>
-      <w:r>
-        <w:rPr>
-          <w:i/>
-          <w:iCs/>
-        </w:rPr>
-        <w:t xml:space="preserve"> </w:t>
-      </w:r>
-      <w:r>
-        <w:rPr>
-          <w:i/>
-          <w:iCs/>
-        </w:rPr>
-        <w:t xml:space="preserve">York</w:t>
-      </w:r>
-      <w:r>
-        <w:rPr>
-          <w:i/>
-          <w:iCs/>
-        </w:rPr>
-        <w:t xml:space="preserve"> </w:t>
-      </w:r>
-      <w:r>
-        <w:rPr>
-          <w:i/>
-          <w:iCs/>
-        </w:rPr>
-        <w:t xml:space="preserve">County</w:t>
-      </w:r>
-    </w:p>
-    <w:p>
-      <w:pPr>
-        <w:keepLines/>
-        <w:spacing w:before="0" w:after="0" w:line="380" w:lineRule="exact"/>
-        <w:ind w:left="4680" w:firstLine="0"/>
-      </w:pPr>
-      <w:r>
-        <w:t xml:space="preserve">January</w:t>
-      </w:r>
-      <w:r>
-        <w:t xml:space="preserve"> </w:t>
-      </w:r>
-      <w:r>
-        <w:t xml:space="preserve">12,</w:t>
-      </w:r>
-      <w:r>
-        <w:t xml:space="preserve"> </w:t>
-      </w:r>
-      <w:r>
-        <w:t xml:space="preserve">2024</w:t>
-      </w:r>
-    </w:p>
-    <w:p>
-      <w:pPr>
-        <w:keepNext/>
-        <w:keepLines/>
+        <w:spacing w:before="0" w:after="0" w:line="420" w:lineRule="exact"/>
+      </w:pPr>
+    </w:p>
+    <w:tbl>
+      <w:tblPr>
+        <w:tblW w:w="9360" w:type="dxa"/>
+        <w:tblLayout w:type="fixed"/>
+        <w:tblCellMar>
+          <w:top w:w="0" w:type="dxa"/>
+          <w:left w:w="0" w:type="dxa"/>
+          <w:bottom w:w="0" w:type="dxa"/>
+          <w:right w:w="0" w:type="dxa"/>
+        </w:tblCellMar>
+        <w:tblLook w:val="0000" w:firstRow="0" w:lastRow="0" w:firstColumn="0" w:lastColumn="0" w:noHBand="0" w:noVBand="0"/>
+      </w:tblPr>
+      <w:tblGrid>
+        <w:gridCol w:w="9360"/>
+      </w:tblGrid>
+      <w:tr>
+        <w:trPr>
+          <w:cantSplit/>
+        </w:trPr>
+        <w:tc>
+          <w:tcPr>
+            <w:tcW w:w="9360" w:type="dxa"/>
+          </w:tcPr>
+          <w:p>
+            <w:pPr>
+              <w:spacing w:before="0" w:after="0" w:line="322" w:lineRule="exact"/>
+              <w:ind w:left="4680" w:firstLine="0"/>
+              <w:jc w:val="left"/>
+            </w:pPr>
+            <w:r>
+              <w:t xml:space="preserve">Respectfully</w:t>
+            </w:r>
+            <w:r>
+              <w:t xml:space="preserve"> </w:t>
+            </w:r>
+            <w:r>
+              <w:t xml:space="preserve">submitted,</w:t>
+            </w:r>
+          </w:p>
+          <w:p>
+            <w:pPr>
+              <w:spacing w:before="504" w:after="0" w:line="322" w:lineRule="exact"/>
+              <w:ind w:left="4680" w:firstLine="0"/>
+              <w:jc w:val="left"/>
+            </w:pPr>
+            <w:r>
+              <w:t xml:space="preserve">MICHAEL</w:t>
+            </w:r>
+            <w:r>
+              <w:t xml:space="preserve"> </w:t>
+            </w:r>
+            <w:r>
+              <w:t xml:space="preserve">J.</w:t>
+            </w:r>
+            <w:r>
+              <w:t xml:space="preserve"> </w:t>
+            </w:r>
+            <w:r>
+              <w:t xml:space="preserve">YETTER</w:t>
+            </w:r>
+          </w:p>
+          <w:p>
+            <w:pPr>
+              <w:spacing w:before="0" w:after="0" w:line="322" w:lineRule="exact"/>
+              <w:ind w:left="4680" w:firstLine="0"/>
+              <w:jc w:val="left"/>
+            </w:pPr>
+            <w:r>
+              <w:rPr>
+                <w:i/>
+                <w:iCs/>
+              </w:rPr>
+              <w:t xml:space="preserve">Assistant</w:t>
+            </w:r>
+            <w:r>
+              <w:rPr>
+                <w:i/>
+                <w:iCs/>
+              </w:rPr>
+              <w:t xml:space="preserve"> </w:t>
+            </w:r>
+            <w:r>
+              <w:rPr>
+                <w:i/>
+                <w:iCs/>
+              </w:rPr>
+              <w:t xml:space="preserve">District</w:t>
+            </w:r>
+            <w:r>
+              <w:rPr>
+                <w:i/>
+                <w:iCs/>
+              </w:rPr>
+              <w:t xml:space="preserve"> </w:t>
+            </w:r>
+            <w:r>
+              <w:rPr>
+                <w:i/>
+                <w:iCs/>
+              </w:rPr>
+              <w:t xml:space="preserve">Attorney</w:t>
+            </w:r>
+          </w:p>
+          <w:p>
+            <w:pPr>
+              <w:spacing w:before="0" w:after="0" w:line="322" w:lineRule="exact"/>
+              <w:ind w:left="4680" w:firstLine="0"/>
+              <w:jc w:val="left"/>
+            </w:pPr>
+            <w:r>
+              <w:rPr>
+                <w:i/>
+                <w:iCs/>
+              </w:rPr>
+              <w:t xml:space="preserve">for</w:t>
+            </w:r>
+            <w:r>
+              <w:rPr>
+                <w:i/>
+                <w:iCs/>
+              </w:rPr>
+              <w:t xml:space="preserve"> </w:t>
+            </w:r>
+            <w:r>
+              <w:rPr>
+                <w:i/>
+                <w:iCs/>
+              </w:rPr>
+              <w:t xml:space="preserve">Alvin</w:t>
+            </w:r>
+            <w:r>
+              <w:rPr>
+                <w:i/>
+                <w:iCs/>
+              </w:rPr>
+              <w:t xml:space="preserve"> </w:t>
+            </w:r>
+            <w:r>
+              <w:rPr>
+                <w:i/>
+                <w:iCs/>
+              </w:rPr>
+              <w:t xml:space="preserve">L.</w:t>
+            </w:r>
+            <w:r>
+              <w:rPr>
+                <w:i/>
+                <w:iCs/>
+              </w:rPr>
+              <w:t xml:space="preserve"> </w:t>
+            </w:r>
+            <w:r>
+              <w:rPr>
+                <w:i/>
+                <w:iCs/>
+              </w:rPr>
+              <w:t xml:space="preserve">Bragg,</w:t>
+            </w:r>
+            <w:r>
+              <w:rPr>
+                <w:i/>
+                <w:iCs/>
+              </w:rPr>
+              <w:t xml:space="preserve"> </w:t>
+            </w:r>
+            <w:r>
+              <w:rPr>
+                <w:i/>
+                <w:iCs/>
+              </w:rPr>
+              <w:t xml:space="preserve">Jr.,</w:t>
+            </w:r>
+            <w:r>
+              <w:rPr>
+                <w:i/>
+                <w:iCs/>
+              </w:rPr>
+              <w:t xml:space="preserve"> </w:t>
+            </w:r>
+            <w:r>
+              <w:rPr>
+                <w:i/>
+                <w:iCs/>
+              </w:rPr>
+              <w:t xml:space="preserve">District</w:t>
+            </w:r>
+            <w:r>
+              <w:rPr>
+                <w:i/>
+                <w:iCs/>
+              </w:rPr>
+              <w:t xml:space="preserve"> </w:t>
+            </w:r>
+            <w:r>
+              <w:rPr>
+                <w:i/>
+                <w:iCs/>
+              </w:rPr>
+              <w:t xml:space="preserve">Attorney,</w:t>
+            </w:r>
+            <w:r>
+              <w:rPr>
+                <w:i/>
+                <w:iCs/>
+              </w:rPr>
+              <w:t xml:space="preserve"> </w:t>
+            </w:r>
+            <w:r>
+              <w:rPr>
+                <w:i/>
+                <w:iCs/>
+              </w:rPr>
+              <w:t xml:space="preserve">New</w:t>
+            </w:r>
+            <w:r>
+              <w:rPr>
+                <w:i/>
+                <w:iCs/>
+              </w:rPr>
+              <w:t xml:space="preserve"> </w:t>
+            </w:r>
+            <w:r>
+              <w:rPr>
+                <w:i/>
+                <w:iCs/>
+              </w:rPr>
+              <w:t xml:space="preserve">York</w:t>
+            </w:r>
+            <w:r>
+              <w:rPr>
+                <w:i/>
+                <w:iCs/>
+              </w:rPr>
+              <w:t xml:space="preserve"> </w:t>
+            </w:r>
+            <w:r>
+              <w:rPr>
+                <w:i/>
+                <w:iCs/>
+              </w:rPr>
+              <w:t xml:space="preserve">County</w:t>
+            </w:r>
+          </w:p>
+          <w:p>
+            <w:pPr>
+              <w:spacing w:before="0" w:after="0" w:line="322" w:lineRule="exact"/>
+              <w:ind w:left="4680" w:firstLine="0"/>
+              <w:jc w:val="left"/>
+            </w:pPr>
+            <w:r>
+              <w:t xml:space="preserve">January</w:t>
+            </w:r>
+            <w:r>
+              <w:t xml:space="preserve"> </w:t>
+            </w:r>
+            <w:r>
+              <w:t xml:space="preserve">12,</w:t>
+            </w:r>
+            <w:r>
+              <w:t xml:space="preserve"> </w:t>
+            </w:r>
+            <w:r>
+              <w:t xml:space="preserve">2024</w:t>
+            </w:r>
+          </w:p>
+        </w:tc>
+      </w:tr>
+    </w:tbl>
+    <w:p>
+      <w:pPr>
         <w:pageBreakBefore/>
-        <w:spacing w:before="0" w:after="280" w:line="380" w:lineRule="exact"/>
+        <w:spacing w:before="0" w:after="0" w:line="1" w:lineRule="exact"/>
+      </w:pPr>
+    </w:p>
+    <w:p>
+      <w:pPr>
+        <w:spacing w:before="0" w:after="336" w:line="322" w:lineRule="exact"/>
         <w:ind w:left="0" w:firstLine="0"/>
         <w:jc w:val="center"/>
       </w:pPr>
@@ -3021,67 +3201,396 @@
           <w:b/>
           <w:bCs/>
         </w:rPr>
-        <w:t xml:space="preserve">CERTIFICATE OF COMPLIANCE</w:t>
-      </w:r>
-    </w:p>
-    <w:p>
-      <w:pPr>
-        <w:spacing w:before="0" w:after="0" w:line="628" w:lineRule="exact"/>
+        <w:t xml:space="preserve">CERTIFICATE</w:t>
+      </w:r>
+      <w:r>
+        <w:rPr>
+          <w:b/>
+          <w:bCs/>
+        </w:rPr>
+        <w:t xml:space="preserve"> </w:t>
+      </w:r>
+      <w:r>
+        <w:rPr>
+          <w:b/>
+          <w:bCs/>
+        </w:rPr>
+        <w:t xml:space="preserve">OF</w:t>
+      </w:r>
+      <w:r>
+        <w:rPr>
+          <w:b/>
+          <w:bCs/>
+        </w:rPr>
+        <w:t xml:space="preserve"> </w:t>
+      </w:r>
+      <w:r>
+        <w:rPr>
+          <w:b/>
+          <w:bCs/>
+        </w:rPr>
+        <w:t xml:space="preserve">COMPLIANCE</w:t>
+      </w:r>
+    </w:p>
+    <w:p>
+      <w:pPr>
+        <w:spacing w:before="0" w:after="0" w:line="644" w:lineRule="exact"/>
         <w:ind w:left="0" w:firstLine="720"/>
-      </w:pPr>
-      <w:r>
-        <w:t xml:space="preserve">I certify that this brief complies with the word limit of 22 NYCRR 500.13(c)⁠(1), that it contains 2,015 words in the body of the brief, excluding the caption, tables and signature block, and that the count was made by the word-processing system used to prepare it.</w:t>
-      </w:r>
-    </w:p>
-    <w:p>
-      <w:pPr>
-        <w:keepNext/>
-        <w:keepLines/>
-        <w:spacing w:before="420" w:after="0" w:line="380" w:lineRule="exact"/>
-        <w:ind w:left="4680" w:firstLine="0"/>
-      </w:pPr>
-      <w:r>
-        <w:t xml:space="preserve">MICHAEL</w:t>
-      </w:r>
-      <w:r>
-        <w:t xml:space="preserve"> </w:t>
-      </w:r>
-      <w:r>
-        <w:t xml:space="preserve">J.</w:t>
-      </w:r>
-      <w:r>
-        <w:t xml:space="preserve"> </w:t>
-      </w:r>
-      <w:r>
-        <w:t xml:space="preserve">YETTER</w:t>
-      </w:r>
-    </w:p>
-    <w:p>
-      <w:pPr>
-        <w:keepLines/>
-        <w:spacing w:before="0" w:after="0" w:line="380" w:lineRule="exact"/>
-        <w:ind w:left="4680" w:firstLine="0"/>
-      </w:pPr>
-      <w:r>
-        <w:t xml:space="preserve">January</w:t>
-      </w:r>
-      <w:r>
-        <w:t xml:space="preserve"> </w:t>
-      </w:r>
-      <w:r>
-        <w:t xml:space="preserve">12,</w:t>
-      </w:r>
-      <w:r>
-        <w:t xml:space="preserve"> </w:t>
-      </w:r>
-      <w:r>
-        <w:t xml:space="preserve">2024</w:t>
-      </w:r>
-    </w:p>
+        <w:jc w:val="left"/>
+      </w:pPr>
+      <w:r>
+        <w:t xml:space="preserve">I</w:t>
+      </w:r>
+      <w:r>
+        <w:t xml:space="preserve"> </w:t>
+      </w:r>
+      <w:r>
+        <w:t xml:space="preserve">certify</w:t>
+      </w:r>
+      <w:r>
+        <w:t xml:space="preserve"> </w:t>
+      </w:r>
+      <w:r>
+        <w:t xml:space="preserve">that</w:t>
+      </w:r>
+      <w:r>
+        <w:t xml:space="preserve"> </w:t>
+      </w:r>
+      <w:r>
+        <w:t xml:space="preserve">this</w:t>
+      </w:r>
+      <w:r>
+        <w:t xml:space="preserve"> </w:t>
+      </w:r>
+      <w:r>
+        <w:t xml:space="preserve">brief</w:t>
+      </w:r>
+      <w:r>
+        <w:t xml:space="preserve"> </w:t>
+      </w:r>
+      <w:r>
+        <w:t xml:space="preserve">complies</w:t>
+      </w:r>
+      <w:r>
+        <w:t xml:space="preserve"> </w:t>
+      </w:r>
+      <w:r>
+        <w:t xml:space="preserve">with</w:t>
+      </w:r>
+      <w:r>
+        <w:t xml:space="preserve"> </w:t>
+      </w:r>
+      <w:r>
+        <w:t xml:space="preserve">the</w:t>
+      </w:r>
+      <w:r>
+        <w:t xml:space="preserve"> </w:t>
+      </w:r>
+      <w:r>
+        <w:t xml:space="preserve">word</w:t>
+      </w:r>
+      <w:r>
+        <w:t xml:space="preserve"> </w:t>
+      </w:r>
+      <w:r>
+        <w:t xml:space="preserve">limit</w:t>
+      </w:r>
+      <w:r>
+        <w:t xml:space="preserve"> </w:t>
+      </w:r>
+      <w:r>
+        <w:t xml:space="preserve">of</w:t>
+      </w:r>
+      <w:r>
+        <w:t xml:space="preserve"> </w:t>
+      </w:r>
+      <w:r>
+        <w:t xml:space="preserve">22</w:t>
+      </w:r>
+      <w:r>
+        <w:t xml:space="preserve"> </w:t>
+      </w:r>
+      <w:r>
+        <w:t xml:space="preserve">NYCRR</w:t>
+      </w:r>
+      <w:r>
+        <w:t xml:space="preserve"> </w:t>
+      </w:r>
+      <w:r>
+        <w:t xml:space="preserve">500.13(c)⁠(1),</w:t>
+      </w:r>
+      <w:r>
+        <w:t xml:space="preserve"> </w:t>
+      </w:r>
+      <w:r>
+        <w:t xml:space="preserve">that</w:t>
+      </w:r>
+      <w:r>
+        <w:t xml:space="preserve"> </w:t>
+      </w:r>
+      <w:r>
+        <w:t xml:space="preserve">it</w:t>
+      </w:r>
+      <w:r>
+        <w:t xml:space="preserve"> </w:t>
+      </w:r>
+      <w:r>
+        <w:t xml:space="preserve">contains</w:t>
+      </w:r>
+      <w:r>
+        <w:t xml:space="preserve"> </w:t>
+      </w:r>
+      <w:r>
+        <w:t xml:space="preserve">2,125</w:t>
+      </w:r>
+      <w:r>
+        <w:t xml:space="preserve"> </w:t>
+      </w:r>
+      <w:r>
+        <w:t xml:space="preserve">words</w:t>
+      </w:r>
+      <w:r>
+        <w:t xml:space="preserve"> </w:t>
+      </w:r>
+      <w:r>
+        <w:t xml:space="preserve">in</w:t>
+      </w:r>
+      <w:r>
+        <w:t xml:space="preserve"> </w:t>
+      </w:r>
+      <w:r>
+        <w:t xml:space="preserve">the</w:t>
+      </w:r>
+      <w:r>
+        <w:t xml:space="preserve"> </w:t>
+      </w:r>
+      <w:r>
+        <w:t xml:space="preserve">body</w:t>
+      </w:r>
+      <w:r>
+        <w:t xml:space="preserve"> </w:t>
+      </w:r>
+      <w:r>
+        <w:t xml:space="preserve">of</w:t>
+      </w:r>
+      <w:r>
+        <w:t xml:space="preserve"> </w:t>
+      </w:r>
+      <w:r>
+        <w:t xml:space="preserve">the</w:t>
+      </w:r>
+      <w:r>
+        <w:t xml:space="preserve"> </w:t>
+      </w:r>
+      <w:r>
+        <w:t xml:space="preserve">brief,</w:t>
+      </w:r>
+      <w:r>
+        <w:t xml:space="preserve"> </w:t>
+      </w:r>
+      <w:r>
+        <w:t xml:space="preserve">excluding</w:t>
+      </w:r>
+      <w:r>
+        <w:t xml:space="preserve"> </w:t>
+      </w:r>
+      <w:r>
+        <w:t xml:space="preserve">the</w:t>
+      </w:r>
+      <w:r>
+        <w:t xml:space="preserve"> </w:t>
+      </w:r>
+      <w:r>
+        <w:t xml:space="preserve">caption,</w:t>
+      </w:r>
+      <w:r>
+        <w:t xml:space="preserve"> </w:t>
+      </w:r>
+      <w:r>
+        <w:t xml:space="preserve">tables</w:t>
+      </w:r>
+      <w:r>
+        <w:t xml:space="preserve"> </w:t>
+      </w:r>
+      <w:r>
+        <w:t xml:space="preserve">and</w:t>
+      </w:r>
+      <w:r>
+        <w:t xml:space="preserve"> </w:t>
+      </w:r>
+      <w:r>
+        <w:t xml:space="preserve">signature</w:t>
+      </w:r>
+      <w:r>
+        <w:t xml:space="preserve"> </w:t>
+      </w:r>
+      <w:r>
+        <w:t xml:space="preserve">block,</w:t>
+      </w:r>
+      <w:r>
+        <w:t xml:space="preserve"> </w:t>
+      </w:r>
+      <w:r>
+        <w:t xml:space="preserve">and</w:t>
+      </w:r>
+      <w:r>
+        <w:t xml:space="preserve"> </w:t>
+      </w:r>
+      <w:r>
+        <w:t xml:space="preserve">that</w:t>
+      </w:r>
+      <w:r>
+        <w:t xml:space="preserve"> </w:t>
+      </w:r>
+      <w:r>
+        <w:t xml:space="preserve">the</w:t>
+      </w:r>
+      <w:r>
+        <w:t xml:space="preserve"> </w:t>
+      </w:r>
+      <w:r>
+        <w:t xml:space="preserve">count</w:t>
+      </w:r>
+      <w:r>
+        <w:t xml:space="preserve"> </w:t>
+      </w:r>
+      <w:r>
+        <w:t xml:space="preserve">was</w:t>
+      </w:r>
+      <w:r>
+        <w:t xml:space="preserve"> </w:t>
+      </w:r>
+      <w:r>
+        <w:t xml:space="preserve">made</w:t>
+      </w:r>
+      <w:r>
+        <w:t xml:space="preserve"> </w:t>
+      </w:r>
+      <w:r>
+        <w:t xml:space="preserve">by</w:t>
+      </w:r>
+      <w:r>
+        <w:t xml:space="preserve"> </w:t>
+      </w:r>
+      <w:r>
+        <w:t xml:space="preserve">the</w:t>
+      </w:r>
+      <w:r>
+        <w:t xml:space="preserve"> </w:t>
+      </w:r>
+      <w:r>
+        <w:t xml:space="preserve">word-processing</w:t>
+      </w:r>
+      <w:r>
+        <w:t xml:space="preserve"> </w:t>
+      </w:r>
+      <w:r>
+        <w:t xml:space="preserve">system</w:t>
+      </w:r>
+      <w:r>
+        <w:t xml:space="preserve"> </w:t>
+      </w:r>
+      <w:r>
+        <w:t xml:space="preserve">used</w:t>
+      </w:r>
+      <w:r>
+        <w:t xml:space="preserve"> </w:t>
+      </w:r>
+      <w:r>
+        <w:t xml:space="preserve">to</w:t>
+      </w:r>
+      <w:r>
+        <w:t xml:space="preserve"> </w:t>
+      </w:r>
+      <w:r>
+        <w:t xml:space="preserve">prepare</w:t>
+      </w:r>
+      <w:r>
+        <w:t xml:space="preserve"> </w:t>
+      </w:r>
+      <w:r>
+        <w:t xml:space="preserve">it.</w:t>
+      </w:r>
+    </w:p>
+    <w:p>
+      <w:pPr>
+        <w:spacing w:before="0" w:after="0" w:line="420" w:lineRule="exact"/>
+      </w:pPr>
+    </w:p>
+    <w:tbl>
+      <w:tblPr>
+        <w:tblW w:w="9360" w:type="dxa"/>
+        <w:tblLayout w:type="fixed"/>
+        <w:tblCellMar>
+          <w:top w:w="0" w:type="dxa"/>
+          <w:left w:w="0" w:type="dxa"/>
+          <w:bottom w:w="0" w:type="dxa"/>
+          <w:right w:w="0" w:type="dxa"/>
+        </w:tblCellMar>
+        <w:tblLook w:val="0000" w:firstRow="0" w:lastRow="0" w:firstColumn="0" w:lastColumn="0" w:noHBand="0" w:noVBand="0"/>
+      </w:tblPr>
+      <w:tblGrid>
+        <w:gridCol w:w="9360"/>
+      </w:tblGrid>
+      <w:tr>
+        <w:trPr>
+          <w:cantSplit/>
+        </w:trPr>
+        <w:tc>
+          <w:tcPr>
+            <w:tcW w:w="9360" w:type="dxa"/>
+          </w:tcPr>
+          <w:p>
+            <w:pPr>
+              <w:spacing w:before="0" w:after="0" w:line="322" w:lineRule="exact"/>
+              <w:ind w:left="4680" w:firstLine="0"/>
+              <w:jc w:val="left"/>
+            </w:pPr>
+            <w:r>
+              <w:t xml:space="preserve">MICHAEL</w:t>
+            </w:r>
+            <w:r>
+              <w:t xml:space="preserve"> </w:t>
+            </w:r>
+            <w:r>
+              <w:t xml:space="preserve">J.</w:t>
+            </w:r>
+            <w:r>
+              <w:t xml:space="preserve"> </w:t>
+            </w:r>
+            <w:r>
+              <w:t xml:space="preserve">YETTER</w:t>
+            </w:r>
+          </w:p>
+          <w:p>
+            <w:pPr>
+              <w:spacing w:before="0" w:after="0" w:line="322" w:lineRule="exact"/>
+              <w:ind w:left="4680" w:firstLine="0"/>
+              <w:jc w:val="left"/>
+            </w:pPr>
+            <w:r>
+              <w:t xml:space="preserve">January</w:t>
+            </w:r>
+            <w:r>
+              <w:t xml:space="preserve"> </w:t>
+            </w:r>
+            <w:r>
+              <w:t xml:space="preserve">12,</w:t>
+            </w:r>
+            <w:r>
+              <w:t xml:space="preserve"> </w:t>
+            </w:r>
+            <w:r>
+              <w:t xml:space="preserve">2024</w:t>
+            </w:r>
+          </w:p>
+        </w:tc>
+      </w:tr>
+    </w:tbl>
     <w:sectPr>
-      <w:footerReference w:type="default" r:id="rIdFtrPage"/>
+      <w:footerReference w:type="default" r:id="rIdXdPage"/>
       <w:pgSz w:w="12240" w:h="15840"/>
-      <w:pgMar w:top="1440" w:right="1440" w:bottom="1440" w:left="1440" w:header="720" w:footer="644" w:gutter="0"/>
+      <w:pgMar w:top="1440" w:right="1440" w:bottom="1440" w:left="1440" w:header="720" w:footer="686" w:gutter="0"/>
       <w:pgNumType w:fmt="decimal" w:start="1"/>
     </w:sectPr>
   </w:body>
@@ -3096,6 +3605,7 @@
 <w:ftr xmlns:w="http://schemas.openxmlformats.org/wordprocessingml/2006/main" xmlns:r="http://schemas.openxmlformats.org/officeDocument/2006/relationships">
   <w:p>
     <w:pPr>
+      <w:spacing w:before="0" w:after="0" w:line="322" w:lineRule="exact"/>
       <w:jc w:val="center"/>
     </w:pPr>
     <w:r>
@@ -3195,6 +3705,43 @@
 </w:ftr>
 </file>
 
+<file path=word/ftr-own1.xml><?xml version="1.0" encoding="utf-8"?>
+<w:ftr xmlns:w="http://schemas.openxmlformats.org/wordprocessingml/2006/main" xmlns:r="http://schemas.openxmlformats.org/officeDocument/2006/relationships">
+  <w:p>
+    <w:pPr>
+      <w:spacing w:before="0" w:after="0" w:line="322" w:lineRule="exact"/>
+      <w:jc w:val="center"/>
+    </w:pPr>
+    <w:r>
+      <w:fldChar w:fldCharType="begin"/>
+    </w:r>
+    <w:r>
+      <w:instrText xml:space="preserve"> PAGE </w:instrText>
+    </w:r>
+    <w:r>
+      <w:fldChar w:fldCharType="separate"/>
+    </w:r>
+    <w:r>
+      <w:t>1</w:t>
+    </w:r>
+    <w:r>
+      <w:fldChar w:fldCharType="end"/>
+    </w:r>
+  </w:p>
+</w:ftr>
+</file>
+
+<file path=word/ftr-own2.xml><?xml version="1.0" encoding="utf-8"?>
+<w:ftr xmlns:w="http://schemas.openxmlformats.org/wordprocessingml/2006/main" xmlns:r="http://schemas.openxmlformats.org/officeDocument/2006/relationships">
+  <w:p>
+    <w:pPr>
+      <w:spacing w:before="0" w:after="0" w:line="322" w:lineRule="exact"/>
+      <w:jc w:val="center"/>
+    </w:pPr>
+  </w:p>
+</w:ftr>
+</file>
+
 <file path=word/ftr-page.xml><?xml version="1.0" encoding="utf-8"?>
 <w:ftr xmlns:w="http://schemas.openxmlformats.org/wordprocessingml/2006/main" xmlns:r="http://schemas.openxmlformats.org/officeDocument/2006/relationships">
   <w:p>
@@ -3334,8 +3881,9 @@
     <w:link w:val="BodyTextChar"/>
     <w:qFormat/>
     <w:pPr>
-      <w:spacing w:before="0" w:after="0" w:line="628" w:lineRule="exact"/>
+      <w:spacing w:before="0" w:after="0" w:line="644" w:lineRule="exact"/>
       <w:ind w:firstLine="720"/>
+      <w:jc w:val="both"/>
     </w:pPr>
   </w:style>
   <w:style w:type="paragraph" w:customStyle="1" w:styleId="FirstParagraph">
@@ -3496,7 +4044,7 @@
     <w:pPr>
       <w:keepNext/>
       <w:keepLines/>
-      <w:spacing w:before="240" w:after="120" w:line="380" w:lineRule="exact"/>
+      <w:spacing w:before="240" w:after="120" w:line="322" w:lineRule="exact"/>
       <w:ind w:firstLine="0"/>
       <w:jc w:val="center"/>
       <w:outlineLvl w:val="0"/>
@@ -3524,7 +4072,7 @@
     <w:pPr>
       <w:keepNext/>
       <w:keepLines/>
-      <w:spacing w:before="240" w:after="120" w:line="380" w:lineRule="exact"/>
+      <w:spacing w:before="240" w:after="120" w:line="322" w:lineRule="exact"/>
       <w:ind w:firstLine="0"/>
       <w:outlineLvl w:val="1"/>
     </w:pPr>
@@ -3550,7 +4098,7 @@
     <w:pPr>
       <w:keepNext/>
       <w:keepLines/>
-      <w:spacing w:before="240" w:after="120" w:line="380" w:lineRule="exact"/>
+      <w:spacing w:before="240" w:after="120" w:line="322" w:lineRule="exact"/>
       <w:ind w:firstLine="0"/>
       <w:outlineLvl w:val="2"/>
     </w:pPr>
@@ -3576,7 +4124,7 @@
     <w:pPr>
       <w:keepNext/>
       <w:keepLines/>
-      <w:spacing w:before="240" w:after="120" w:line="380" w:lineRule="exact"/>
+      <w:spacing w:before="240" w:after="120" w:line="322" w:lineRule="exact"/>
       <w:ind w:firstLine="0"/>
       <w:outlineLvl w:val="3"/>
     </w:pPr>
@@ -3603,7 +4151,7 @@
     <w:pPr>
       <w:keepNext/>
       <w:keepLines/>
-      <w:spacing w:before="240" w:after="120" w:line="380" w:lineRule="exact"/>
+      <w:spacing w:before="240" w:after="120" w:line="322" w:lineRule="exact"/>
       <w:ind w:firstLine="0"/>
       <w:outlineLvl w:val="4"/>
     </w:pPr>
@@ -3829,7 +4377,7 @@
     <w:basedOn w:val="BodyText"/>
     <w:qFormat/>
     <w:pPr>
-      <w:spacing w:before="0" w:after="0" w:line="628" w:lineRule="exact"/>
+      <w:spacing w:before="0" w:after="0" w:line="644" w:lineRule="exact"/>
       <w:ind w:left="720" w:hanging="720"/>
     </w:pPr>
   </w:style>
@@ -3841,7 +4389,7 @@
     <w:unhideWhenUsed/>
     <w:qFormat/>
     <w:pPr>
-      <w:spacing w:before="280" w:after="280" w:line="380" w:lineRule="exact"/>
+      <w:spacing w:before="280" w:after="280" w:line="322" w:lineRule="exact"/>
       <w:ind w:firstLine="0" w:left="720" w:right="720"/>
     </w:pPr>
   </w:style>
@@ -3854,7 +4402,8 @@
     <w:qFormat/>
     <w:pPr>
       <w:keepLines/>
-      <w:spacing w:before="0" w:after="140" w:line="326" w:lineRule="exact"/>
+      <w:spacing w:before="0" w:after="140" w:line="276" w:lineRule="exact"/>
+      <w:jc w:val="both"/>
     </w:pPr>
     <w:rPr>
       <w:sz w:val="24"/>
@@ -4005,6 +4554,146 @@
     <w:qFormat/>
     <w:pPr>
       <w:widowControl w:val="0"/>
+    </w:pPr>
+  </w:style>
+  <w:style w:type="paragraph" w:customStyle="1" w:styleId="XdQuote">
+    <w:name w:val="Xd Quote"/>
+    <w:basedOn w:val="Normal"/>
+    <w:qFormat/>
+    <w:pPr>
+      <w:spacing w:before="0" w:after="0" w:line="322" w:lineRule="exact"/>
+      <w:ind w:left="720" w:right="720" w:firstLine="0"/>
+      <w:jc w:val="both"/>
+    </w:pPr>
+  </w:style>
+  <w:style w:type="paragraph" w:customStyle="1" w:styleId="XdQuoteFirst">
+    <w:name w:val="Xd Quote First"/>
+    <w:basedOn w:val="Normal"/>
+    <w:qFormat/>
+    <w:pPr>
+      <w:spacing w:before="280" w:after="0" w:line="322" w:lineRule="exact"/>
+      <w:ind w:left="720" w:right="720" w:firstLine="0"/>
+      <w:jc w:val="both"/>
+    </w:pPr>
+  </w:style>
+  <w:style w:type="paragraph" w:customStyle="1" w:styleId="XdQuoteLast">
+    <w:name w:val="Xd Quote Last"/>
+    <w:basedOn w:val="Normal"/>
+    <w:qFormat/>
+    <w:pPr>
+      <w:spacing w:before="0" w:after="280" w:line="322" w:lineRule="exact"/>
+      <w:ind w:left="720" w:right="720" w:firstLine="0"/>
+      <w:jc w:val="both"/>
+    </w:pPr>
+  </w:style>
+  <w:style w:type="paragraph" w:customStyle="1" w:styleId="XdQuoteOnly">
+    <w:name w:val="Xd Quote Only"/>
+    <w:basedOn w:val="Normal"/>
+    <w:qFormat/>
+    <w:pPr>
+      <w:spacing w:before="280" w:after="280" w:line="322" w:lineRule="exact"/>
+      <w:ind w:left="720" w:right="720" w:firstLine="0"/>
+      <w:jc w:val="both"/>
+    </w:pPr>
+  </w:style>
+  <w:style w:type="paragraph" w:customStyle="1" w:styleId="XdTail">
+    <w:name w:val="Xd Tail"/>
+    <w:basedOn w:val="Normal"/>
+    <w:qFormat/>
+    <w:pPr>
+      <w:spacing w:before="0" w:after="0" w:line="322" w:lineRule="exact"/>
+      <w:ind w:firstLine="0"/>
+      <w:jc w:val="both"/>
+    </w:pPr>
+  </w:style>
+  <w:style w:type="paragraph" w:customStyle="1" w:styleId="XdList1">
+    <w:name w:val="XdList 1"/>
+    <w:basedOn w:val="Normal"/>
+    <w:qFormat/>
+    <w:pPr>
+      <w:spacing w:before="0" w:after="0" w:line="644" w:lineRule="exact"/>
+      <w:ind w:left="720" w:hanging="720"/>
+      <w:jc w:val="both"/>
+    </w:pPr>
+  </w:style>
+  <w:style w:type="paragraph" w:customStyle="1" w:styleId="XdList2">
+    <w:name w:val="XdList 2"/>
+    <w:basedOn w:val="Normal"/>
+    <w:qFormat/>
+    <w:pPr>
+      <w:spacing w:before="0" w:after="0" w:line="644" w:lineRule="exact"/>
+      <w:ind w:left="1440" w:hanging="720"/>
+      <w:jc w:val="both"/>
+    </w:pPr>
+  </w:style>
+  <w:style w:type="paragraph" w:customStyle="1" w:styleId="XdList3">
+    <w:name w:val="XdList 3"/>
+    <w:basedOn w:val="Normal"/>
+    <w:qFormat/>
+    <w:pPr>
+      <w:spacing w:before="0" w:after="0" w:line="644" w:lineRule="exact"/>
+      <w:ind w:left="2160" w:hanging="720"/>
+      <w:jc w:val="both"/>
+    </w:pPr>
+  </w:style>
+  <w:style w:type="paragraph" w:customStyle="1" w:styleId="XdTailList1">
+    <w:name w:val="XdTailList 1"/>
+    <w:basedOn w:val="Normal"/>
+    <w:qFormat/>
+    <w:pPr>
+      <w:spacing w:before="0" w:after="0" w:line="322" w:lineRule="exact"/>
+      <w:ind w:left="720" w:hanging="720"/>
+      <w:jc w:val="both"/>
+    </w:pPr>
+  </w:style>
+  <w:style w:type="paragraph" w:customStyle="1" w:styleId="XdTailList2">
+    <w:name w:val="XdTailList 2"/>
+    <w:basedOn w:val="Normal"/>
+    <w:qFormat/>
+    <w:pPr>
+      <w:spacing w:before="0" w:after="0" w:line="322" w:lineRule="exact"/>
+      <w:ind w:left="1440" w:hanging="720"/>
+      <w:jc w:val="both"/>
+    </w:pPr>
+  </w:style>
+  <w:style w:type="paragraph" w:customStyle="1" w:styleId="XdTailList3">
+    <w:name w:val="XdTailList 3"/>
+    <w:basedOn w:val="Normal"/>
+    <w:qFormat/>
+    <w:pPr>
+      <w:spacing w:before="0" w:after="0" w:line="322" w:lineRule="exact"/>
+      <w:ind w:left="2160" w:hanging="720"/>
+      <w:jc w:val="both"/>
+    </w:pPr>
+  </w:style>
+  <w:style w:type="paragraph" w:customStyle="1" w:styleId="XdQuoteList1">
+    <w:name w:val="Xd Quote List 1"/>
+    <w:basedOn w:val="Normal"/>
+    <w:qFormat/>
+    <w:pPr>
+      <w:spacing w:before="0" w:after="0" w:line="322" w:lineRule="exact"/>
+      <w:ind w:left="1440" w:right="720" w:hanging="720"/>
+      <w:jc w:val="both"/>
+    </w:pPr>
+  </w:style>
+  <w:style w:type="paragraph" w:customStyle="1" w:styleId="XdQuoteList2">
+    <w:name w:val="Xd Quote List 2"/>
+    <w:basedOn w:val="Normal"/>
+    <w:qFormat/>
+    <w:pPr>
+      <w:spacing w:before="0" w:after="0" w:line="322" w:lineRule="exact"/>
+      <w:ind w:left="2160" w:right="720" w:hanging="720"/>
+      <w:jc w:val="both"/>
+    </w:pPr>
+  </w:style>
+  <w:style w:type="paragraph" w:customStyle="1" w:styleId="XdQuoteList3">
+    <w:name w:val="Xd Quote List 3"/>
+    <w:basedOn w:val="Normal"/>
+    <w:qFormat/>
+    <w:pPr>
+      <w:spacing w:before="0" w:after="0" w:line="322" w:lineRule="exact"/>
+      <w:ind w:left="2880" w:right="720" w:hanging="720"/>
+      <w:jc w:val="both"/>
     </w:pPr>
   </w:style>
   <w:style w:type="paragraph" w:customStyle="1" w:styleId="SourceCode">

</xml_diff>